<commit_message>
chore(Update the report.docx in prject)
</commit_message>
<xml_diff>
--- a/report.docx
+++ b/report.docx
@@ -691,12 +691,2005 @@
     </w:p>
     <w:p>
       <w:pPr>
-        <w:spacing w:after="210"/>
-        <w:rPr>
-          <w:rFonts w:eastAsia="Georgia" w:hAnsi="Georgia" w:cs="B Nazanin"/>
-          <w:rtl/>
-        </w:rPr>
-      </w:pPr>
+        <w:rPr>
+          <w:rFonts w:cs="B Nazanin"/>
+          <w:sz w:val="28"/>
+          <w:szCs w:val="28"/>
+          <w:rtl/>
+          <w:lang w:val="en-US"/>
+        </w:rPr>
+      </w:pPr>
+    </w:p>
+    <w:p>
+      <w:pPr>
+        <w:jc w:val="center"/>
+        <w:rPr>
+          <w:rFonts w:cs="B Nazanin"/>
+          <w:b/>
+          <w:bCs/>
+          <w:sz w:val="36"/>
+          <w:szCs w:val="36"/>
+          <w:lang w:val="en-US" w:bidi="fa-IR"/>
+        </w:rPr>
+      </w:pPr>
+      <w:r>
+        <w:rPr>
+          <w:rFonts w:cs="B Nazanin"/>
+          <w:b/>
+          <w:bCs/>
+          <w:sz w:val="36"/>
+          <w:szCs w:val="36"/>
+          <w:rtl/>
+          <w:lang w:val="en-US"/>
+        </w:rPr>
+        <w:lastRenderedPageBreak/>
+        <w:t xml:space="preserve">گزارش پروژه: طراحی و پیاده‌سازی سامانه هوشمند قوانین آموزشی با استفاده از معماری </w:t>
+      </w:r>
+      <w:r>
+        <w:rPr>
+          <w:rFonts w:cs="B Nazanin"/>
+          <w:b/>
+          <w:bCs/>
+          <w:sz w:val="36"/>
+          <w:szCs w:val="36"/>
+          <w:lang w:val="en-US" w:bidi="fa-IR"/>
+        </w:rPr>
+        <w:t>RAG</w:t>
+      </w:r>
+      <w:r>
+        <w:rPr>
+          <w:rFonts w:cs="B Nazanin"/>
+          <w:b/>
+          <w:bCs/>
+          <w:sz w:val="36"/>
+          <w:szCs w:val="36"/>
+          <w:rtl/>
+          <w:lang w:val="en-US"/>
+        </w:rPr>
+        <w:t xml:space="preserve"> و الگوریتم </w:t>
+      </w:r>
+      <w:r>
+        <w:rPr>
+          <w:rFonts w:cs="B Nazanin"/>
+          <w:b/>
+          <w:bCs/>
+          <w:sz w:val="36"/>
+          <w:szCs w:val="36"/>
+          <w:lang w:val="en-US" w:bidi="fa-IR"/>
+        </w:rPr>
+        <w:t>MMR</w:t>
+      </w:r>
+    </w:p>
+    <w:p>
+      <w:pPr>
+        <w:rPr>
+          <w:rFonts w:cs="B Nazanin"/>
+          <w:b/>
+          <w:bCs/>
+          <w:sz w:val="32"/>
+          <w:szCs w:val="32"/>
+          <w:rtl/>
+          <w:lang w:val="en-US"/>
+        </w:rPr>
+      </w:pPr>
+      <w:r>
+        <w:rPr>
+          <w:rFonts w:cs="B Nazanin"/>
+          <w:b/>
+          <w:bCs/>
+          <w:sz w:val="32"/>
+          <w:szCs w:val="32"/>
+          <w:rtl/>
+          <w:lang w:val="en-US" w:bidi="fa-IR"/>
+        </w:rPr>
+        <w:t xml:space="preserve">۱. </w:t>
+      </w:r>
+      <w:r>
+        <w:rPr>
+          <w:rFonts w:cs="B Nazanin"/>
+          <w:b/>
+          <w:bCs/>
+          <w:sz w:val="32"/>
+          <w:szCs w:val="32"/>
+          <w:rtl/>
+          <w:lang w:val="en-US"/>
+        </w:rPr>
+        <w:t>مقدمه و بیان مسئله</w:t>
+      </w:r>
+    </w:p>
+    <w:p>
+      <w:pPr>
+        <w:jc w:val="both"/>
+        <w:rPr>
+          <w:rFonts w:cs="B Nazanin"/>
+          <w:sz w:val="28"/>
+          <w:szCs w:val="28"/>
+          <w:rtl/>
+          <w:lang w:val="en-US"/>
+        </w:rPr>
+      </w:pPr>
+      <w:r>
+        <w:rPr>
+          <w:rFonts w:cs="B Nazanin"/>
+          <w:sz w:val="28"/>
+          <w:szCs w:val="28"/>
+          <w:rtl/>
+          <w:lang w:val="en-US"/>
+        </w:rPr>
+        <w:t xml:space="preserve">پاسخگویی به سؤالات مکرر دانشجویان در خصوص آیین‌نامه‌ها و قوانین آموزشی، همواره یکی از چالش‌های بخش آموزش دانشگاه‌ها بوده است. هدف از این پروژه، توسعه یک سامانه هوشمند مبتنی بر هوش مصنوعی است که با دریافت پرسش به زبان طبیعی، بتواند مستندات دانشگاهی را تحلیل کرده و پاسخی دقیق، مستند و تشریحی ارائه دهد. در این سامانه از معماری </w:t>
+      </w:r>
+      <w:r>
+        <w:rPr>
+          <w:rFonts w:cs="B Nazanin"/>
+          <w:sz w:val="28"/>
+          <w:szCs w:val="28"/>
+          <w:lang w:val="en-US" w:bidi="fa-IR"/>
+        </w:rPr>
+        <w:t>RAG (Retrieval-Augmented Generation)</w:t>
+      </w:r>
+      <w:r>
+        <w:rPr>
+          <w:rFonts w:cs="B Nazanin"/>
+          <w:sz w:val="28"/>
+          <w:szCs w:val="28"/>
+          <w:rtl/>
+          <w:lang w:val="en-US"/>
+        </w:rPr>
+        <w:t xml:space="preserve"> بهره گرفته شده است تا از تولید پاسخ‌های غیرواقعی (</w:t>
+      </w:r>
+      <w:r>
+        <w:rPr>
+          <w:rFonts w:cs="B Nazanin"/>
+          <w:sz w:val="28"/>
+          <w:szCs w:val="28"/>
+          <w:lang w:val="en-US" w:bidi="fa-IR"/>
+        </w:rPr>
+        <w:t>Hallucination</w:t>
+      </w:r>
+      <w:r>
+        <w:rPr>
+          <w:rFonts w:cs="B Nazanin"/>
+          <w:sz w:val="28"/>
+          <w:szCs w:val="28"/>
+          <w:rtl/>
+          <w:lang w:val="en-US"/>
+        </w:rPr>
+        <w:t>) توسط مدل زبانی جلوگیری شود.</w:t>
+      </w:r>
+    </w:p>
+    <w:p>
+      <w:pPr>
+        <w:rPr>
+          <w:rFonts w:cs="B Nazanin"/>
+          <w:b/>
+          <w:bCs/>
+          <w:sz w:val="32"/>
+          <w:szCs w:val="32"/>
+          <w:rtl/>
+          <w:lang w:val="en-US"/>
+        </w:rPr>
+      </w:pPr>
+      <w:r>
+        <w:rPr>
+          <w:rFonts w:cs="B Nazanin"/>
+          <w:b/>
+          <w:bCs/>
+          <w:sz w:val="32"/>
+          <w:szCs w:val="32"/>
+          <w:rtl/>
+          <w:lang w:val="en-US" w:bidi="fa-IR"/>
+        </w:rPr>
+        <w:t xml:space="preserve">۲. </w:t>
+      </w:r>
+      <w:r>
+        <w:rPr>
+          <w:rFonts w:cs="B Nazanin"/>
+          <w:b/>
+          <w:bCs/>
+          <w:sz w:val="32"/>
+          <w:szCs w:val="32"/>
+          <w:rtl/>
+          <w:lang w:val="en-US"/>
+        </w:rPr>
+        <w:t>معماری سیستم و ماژول‌های توسعه‌یافته</w:t>
+      </w:r>
+    </w:p>
+    <w:p>
+      <w:pPr>
+        <w:jc w:val="both"/>
+        <w:rPr>
+          <w:rFonts w:cs="B Nazanin"/>
+          <w:sz w:val="28"/>
+          <w:szCs w:val="28"/>
+          <w:rtl/>
+          <w:lang w:val="en-US"/>
+        </w:rPr>
+      </w:pPr>
+      <w:r>
+        <w:rPr>
+          <w:rFonts w:cs="B Nazanin"/>
+          <w:sz w:val="28"/>
+          <w:szCs w:val="28"/>
+          <w:rtl/>
+          <w:lang w:val="en-US"/>
+        </w:rPr>
+        <w:t>این سامانه در بستر زبان برنامه‌نویسی پایتون و در قالب سه ماژول اصلی توسعه یافته است:</w:t>
+      </w:r>
+    </w:p>
+    <w:p>
+      <w:pPr>
+        <w:rPr>
+          <w:rFonts w:cs="B Nazanin"/>
+          <w:b/>
+          <w:bCs/>
+          <w:sz w:val="28"/>
+          <w:szCs w:val="28"/>
+          <w:rtl/>
+          <w:lang w:val="en-US"/>
+        </w:rPr>
+      </w:pPr>
+      <w:r>
+        <w:rPr>
+          <w:rFonts w:cs="B Nazanin"/>
+          <w:b/>
+          <w:bCs/>
+          <w:sz w:val="28"/>
+          <w:szCs w:val="28"/>
+          <w:rtl/>
+          <w:lang w:val="en-US"/>
+        </w:rPr>
+        <w:t>الف) ماژول تنظیمات پیکربندی (</w:t>
+      </w:r>
+      <w:r>
+        <w:rPr>
+          <w:rFonts w:cs="B Nazanin"/>
+          <w:b/>
+          <w:bCs/>
+          <w:sz w:val="28"/>
+          <w:szCs w:val="28"/>
+          <w:lang w:val="en-US" w:bidi="fa-IR"/>
+        </w:rPr>
+        <w:t>settings.py</w:t>
+      </w:r>
+      <w:r>
+        <w:rPr>
+          <w:rFonts w:cs="B Nazanin"/>
+          <w:b/>
+          <w:bCs/>
+          <w:sz w:val="28"/>
+          <w:szCs w:val="28"/>
+          <w:rtl/>
+          <w:lang w:val="en-US"/>
+        </w:rPr>
+        <w:t>)</w:t>
+      </w:r>
+    </w:p>
+    <w:p>
+      <w:pPr>
+        <w:jc w:val="both"/>
+        <w:rPr>
+          <w:rFonts w:cs="B Nazanin"/>
+          <w:sz w:val="28"/>
+          <w:szCs w:val="28"/>
+          <w:rtl/>
+          <w:lang w:val="en-US"/>
+        </w:rPr>
+      </w:pPr>
+      <w:r>
+        <w:rPr>
+          <w:rFonts w:cs="B Nazanin"/>
+          <w:sz w:val="28"/>
+          <w:szCs w:val="28"/>
+          <w:rtl/>
+          <w:lang w:val="en-US"/>
+        </w:rPr>
+        <w:t>برای مدیریت یکپارچه مسیرها و کلیدهای دسترسی، فایل تنظیماتی ایجاد شده است. در این فایل، مسیر استقرار اسناد (</w:t>
+      </w:r>
+      <w:proofErr w:type="spellStart"/>
+      <w:r>
+        <w:rPr>
+          <w:rFonts w:cs="B Nazanin"/>
+          <w:sz w:val="28"/>
+          <w:szCs w:val="28"/>
+          <w:lang w:val="en-US" w:bidi="fa-IR"/>
+        </w:rPr>
+        <w:t>pdf_docs</w:t>
+      </w:r>
+      <w:proofErr w:type="spellEnd"/>
+      <w:r>
+        <w:rPr>
+          <w:rFonts w:cs="B Nazanin"/>
+          <w:sz w:val="28"/>
+          <w:szCs w:val="28"/>
+          <w:rtl/>
+          <w:lang w:val="en-US"/>
+        </w:rPr>
+        <w:t>)، مسیر ذخیره پایگاه داده (</w:t>
+      </w:r>
+      <w:proofErr w:type="spellStart"/>
+      <w:r>
+        <w:rPr>
+          <w:rFonts w:cs="B Nazanin"/>
+          <w:sz w:val="28"/>
+          <w:szCs w:val="28"/>
+          <w:lang w:val="en-US" w:bidi="fa-IR"/>
+        </w:rPr>
+        <w:t>knowledge_db</w:t>
+      </w:r>
+      <w:proofErr w:type="spellEnd"/>
+      <w:r>
+        <w:rPr>
+          <w:rFonts w:cs="B Nazanin"/>
+          <w:sz w:val="28"/>
+          <w:szCs w:val="28"/>
+          <w:rtl/>
+          <w:lang w:val="en-US"/>
+        </w:rPr>
+        <w:t xml:space="preserve">) و مدل </w:t>
+      </w:r>
+      <w:r>
+        <w:rPr>
+          <w:rFonts w:cs="B Nazanin"/>
+          <w:sz w:val="28"/>
+          <w:szCs w:val="28"/>
+          <w:lang w:val="en-US" w:bidi="fa-IR"/>
+        </w:rPr>
+        <w:t>Embedding</w:t>
+      </w:r>
+      <w:r>
+        <w:rPr>
+          <w:rFonts w:cs="B Nazanin"/>
+          <w:sz w:val="28"/>
+          <w:szCs w:val="28"/>
+          <w:rtl/>
+          <w:lang w:val="en-US"/>
+        </w:rPr>
+        <w:t xml:space="preserve"> با نام </w:t>
+      </w:r>
+      <w:proofErr w:type="spellStart"/>
+      <w:r>
+        <w:rPr>
+          <w:rFonts w:cs="B Nazanin"/>
+          <w:sz w:val="28"/>
+          <w:szCs w:val="28"/>
+          <w:lang w:val="en-US" w:bidi="fa-IR"/>
+        </w:rPr>
+        <w:t>intfloat</w:t>
+      </w:r>
+      <w:proofErr w:type="spellEnd"/>
+      <w:r>
+        <w:rPr>
+          <w:rFonts w:cs="B Nazanin"/>
+          <w:sz w:val="28"/>
+          <w:szCs w:val="28"/>
+          <w:lang w:val="en-US" w:bidi="fa-IR"/>
+        </w:rPr>
+        <w:t>/multilingual-e5-large</w:t>
+      </w:r>
+      <w:r>
+        <w:rPr>
+          <w:rFonts w:cs="B Nazanin"/>
+          <w:sz w:val="28"/>
+          <w:szCs w:val="28"/>
+          <w:rtl/>
+          <w:lang w:val="en-US"/>
+        </w:rPr>
+        <w:t xml:space="preserve"> که در درک مفاهیم زبان فارسی بسیار قدرتمند است، تعریف شده است.</w:t>
+      </w:r>
+    </w:p>
+    <w:p>
+      <w:pPr>
+        <w:rPr>
+          <w:rFonts w:cs="B Nazanin"/>
+          <w:b/>
+          <w:bCs/>
+          <w:sz w:val="28"/>
+          <w:szCs w:val="28"/>
+          <w:rtl/>
+          <w:lang w:val="en-US"/>
+        </w:rPr>
+      </w:pPr>
+      <w:r>
+        <w:rPr>
+          <w:rFonts w:cs="B Nazanin"/>
+          <w:b/>
+          <w:bCs/>
+          <w:sz w:val="28"/>
+          <w:szCs w:val="28"/>
+          <w:rtl/>
+          <w:lang w:val="en-US"/>
+        </w:rPr>
+        <w:t>ب) پردازشگر و وکتورایزر داده‌ها (</w:t>
+      </w:r>
+      <w:r>
+        <w:rPr>
+          <w:rFonts w:cs="B Nazanin"/>
+          <w:b/>
+          <w:bCs/>
+          <w:sz w:val="28"/>
+          <w:szCs w:val="28"/>
+          <w:lang w:val="en-US" w:bidi="fa-IR"/>
+        </w:rPr>
+        <w:t>data_processor.py</w:t>
+      </w:r>
+      <w:r>
+        <w:rPr>
+          <w:rFonts w:cs="B Nazanin"/>
+          <w:b/>
+          <w:bCs/>
+          <w:sz w:val="28"/>
+          <w:szCs w:val="28"/>
+          <w:rtl/>
+          <w:lang w:val="en-US"/>
+        </w:rPr>
+        <w:t>)</w:t>
+      </w:r>
+    </w:p>
+    <w:p>
+      <w:pPr>
+        <w:jc w:val="both"/>
+        <w:rPr>
+          <w:rFonts w:cs="B Nazanin"/>
+          <w:sz w:val="28"/>
+          <w:szCs w:val="28"/>
+          <w:rtl/>
+          <w:lang w:val="en-US"/>
+        </w:rPr>
+      </w:pPr>
+      <w:r>
+        <w:rPr>
+          <w:rFonts w:cs="B Nazanin"/>
+          <w:sz w:val="28"/>
+          <w:szCs w:val="28"/>
+          <w:rtl/>
+          <w:lang w:val="en-US"/>
+        </w:rPr>
+        <w:t>این ماژول وظیفه ساخت پایگاه دانش سیستم را بر عهده دارد که شامل گام‌های زیر است:</w:t>
+      </w:r>
+    </w:p>
+    <w:p>
+      <w:pPr>
+        <w:numPr>
+          <w:ilvl w:val="0"/>
+          <w:numId w:val="1"/>
+        </w:numPr>
+        <w:jc w:val="both"/>
+        <w:rPr>
+          <w:rFonts w:cs="B Nazanin"/>
+          <w:sz w:val="28"/>
+          <w:szCs w:val="28"/>
+          <w:rtl/>
+          <w:lang w:val="en-US"/>
+        </w:rPr>
+      </w:pPr>
+      <w:r>
+        <w:rPr>
+          <w:rFonts w:cs="B Nazanin"/>
+          <w:b/>
+          <w:bCs/>
+          <w:sz w:val="28"/>
+          <w:szCs w:val="28"/>
+          <w:rtl/>
+          <w:lang w:val="en-US"/>
+        </w:rPr>
+        <w:t>تبدیل تصاویر و استخراج متن:</w:t>
+      </w:r>
+      <w:r>
+        <w:rPr>
+          <w:rFonts w:cs="B Nazanin"/>
+          <w:sz w:val="28"/>
+          <w:szCs w:val="28"/>
+          <w:rtl/>
+          <w:lang w:val="en-US"/>
+        </w:rPr>
+        <w:t xml:space="preserve"> فایل‌های </w:t>
+      </w:r>
+      <w:r>
+        <w:rPr>
+          <w:rFonts w:cs="B Nazanin"/>
+          <w:sz w:val="28"/>
+          <w:szCs w:val="28"/>
+          <w:lang w:val="en-US" w:bidi="fa-IR"/>
+        </w:rPr>
+        <w:t>PDF</w:t>
+      </w:r>
+      <w:r>
+        <w:rPr>
+          <w:rFonts w:cs="B Nazanin"/>
+          <w:sz w:val="28"/>
+          <w:szCs w:val="28"/>
+          <w:rtl/>
+          <w:lang w:val="en-US"/>
+        </w:rPr>
+        <w:t xml:space="preserve"> با استفاده از ابزار </w:t>
+      </w:r>
+      <w:proofErr w:type="spellStart"/>
+      <w:r>
+        <w:rPr>
+          <w:rFonts w:cs="B Nazanin"/>
+          <w:sz w:val="28"/>
+          <w:szCs w:val="28"/>
+          <w:lang w:val="en-US" w:bidi="fa-IR"/>
+        </w:rPr>
+        <w:t>poppler</w:t>
+      </w:r>
+      <w:proofErr w:type="spellEnd"/>
+      <w:r>
+        <w:rPr>
+          <w:rFonts w:cs="B Nazanin"/>
+          <w:sz w:val="28"/>
+          <w:szCs w:val="28"/>
+          <w:rtl/>
+          <w:lang w:val="en-US"/>
+        </w:rPr>
+        <w:t xml:space="preserve"> به تصویر تبدیل شده و سپس توسط موتور </w:t>
+      </w:r>
+      <w:r>
+        <w:rPr>
+          <w:rFonts w:cs="B Nazanin"/>
+          <w:sz w:val="28"/>
+          <w:szCs w:val="28"/>
+          <w:lang w:val="en-US" w:bidi="fa-IR"/>
+        </w:rPr>
+        <w:t>Tesseract OCR</w:t>
+      </w:r>
+      <w:r>
+        <w:rPr>
+          <w:rFonts w:cs="B Nazanin"/>
+          <w:sz w:val="28"/>
+          <w:szCs w:val="28"/>
+          <w:rtl/>
+          <w:lang w:val="en-US"/>
+        </w:rPr>
+        <w:t xml:space="preserve"> متون فارسی آن‌ها استخراج می‌شود.</w:t>
+      </w:r>
+    </w:p>
+    <w:p>
+      <w:pPr>
+        <w:numPr>
+          <w:ilvl w:val="0"/>
+          <w:numId w:val="1"/>
+        </w:numPr>
+        <w:jc w:val="both"/>
+        <w:rPr>
+          <w:rFonts w:cs="B Nazanin"/>
+          <w:sz w:val="28"/>
+          <w:szCs w:val="28"/>
+          <w:rtl/>
+          <w:lang w:val="en-US"/>
+        </w:rPr>
+      </w:pPr>
+      <w:r>
+        <w:rPr>
+          <w:rFonts w:cs="B Nazanin"/>
+          <w:b/>
+          <w:bCs/>
+          <w:sz w:val="28"/>
+          <w:szCs w:val="28"/>
+          <w:rtl/>
+          <w:lang w:val="en-US"/>
+        </w:rPr>
+        <w:t>نرمال‌سازی (</w:t>
+      </w:r>
+      <w:r>
+        <w:rPr>
+          <w:rFonts w:cs="B Nazanin"/>
+          <w:b/>
+          <w:bCs/>
+          <w:sz w:val="28"/>
+          <w:szCs w:val="28"/>
+          <w:lang w:val="en-US"/>
+        </w:rPr>
+        <w:t>Normalization</w:t>
+      </w:r>
+      <w:r>
+        <w:rPr>
+          <w:rFonts w:cs="B Nazanin"/>
+          <w:b/>
+          <w:bCs/>
+          <w:sz w:val="28"/>
+          <w:szCs w:val="28"/>
+          <w:rtl/>
+          <w:lang w:val="en-US"/>
+        </w:rPr>
+        <w:t>):</w:t>
+      </w:r>
+      <w:r>
+        <w:rPr>
+          <w:rFonts w:cs="B Nazanin"/>
+          <w:sz w:val="28"/>
+          <w:szCs w:val="28"/>
+          <w:rtl/>
+          <w:lang w:val="en-US"/>
+        </w:rPr>
+        <w:t xml:space="preserve"> برای یکسان‌سازی فاصله‌ها و نیم‌فاصله‌ها در زبان فارسی، از کتابخانه </w:t>
+      </w:r>
+      <w:proofErr w:type="spellStart"/>
+      <w:r>
+        <w:rPr>
+          <w:rFonts w:cs="B Nazanin"/>
+          <w:sz w:val="28"/>
+          <w:szCs w:val="28"/>
+          <w:lang w:val="en-US" w:bidi="fa-IR"/>
+        </w:rPr>
+        <w:t>hazm</w:t>
+      </w:r>
+      <w:proofErr w:type="spellEnd"/>
+      <w:r>
+        <w:rPr>
+          <w:rFonts w:cs="B Nazanin"/>
+          <w:sz w:val="28"/>
+          <w:szCs w:val="28"/>
+          <w:rtl/>
+          <w:lang w:val="en-US"/>
+        </w:rPr>
+        <w:t xml:space="preserve"> استفاده شده است.</w:t>
+      </w:r>
+    </w:p>
+    <w:p>
+      <w:pPr>
+        <w:numPr>
+          <w:ilvl w:val="0"/>
+          <w:numId w:val="1"/>
+        </w:numPr>
+        <w:jc w:val="both"/>
+        <w:rPr>
+          <w:rFonts w:cs="B Nazanin"/>
+          <w:sz w:val="28"/>
+          <w:szCs w:val="28"/>
+          <w:rtl/>
+          <w:lang w:val="en-US"/>
+        </w:rPr>
+      </w:pPr>
+      <w:r>
+        <w:rPr>
+          <w:rFonts w:cs="B Nazanin"/>
+          <w:b/>
+          <w:bCs/>
+          <w:sz w:val="28"/>
+          <w:szCs w:val="28"/>
+          <w:rtl/>
+          <w:lang w:val="en-US"/>
+        </w:rPr>
+        <w:t>تقطیع متون (</w:t>
+      </w:r>
+      <w:r>
+        <w:rPr>
+          <w:rFonts w:cs="B Nazanin"/>
+          <w:b/>
+          <w:bCs/>
+          <w:sz w:val="28"/>
+          <w:szCs w:val="28"/>
+          <w:lang w:val="en-US"/>
+        </w:rPr>
+        <w:t>Chunking</w:t>
+      </w:r>
+      <w:r>
+        <w:rPr>
+          <w:rFonts w:cs="B Nazanin"/>
+          <w:b/>
+          <w:bCs/>
+          <w:sz w:val="28"/>
+          <w:szCs w:val="28"/>
+          <w:rtl/>
+          <w:lang w:val="en-US"/>
+        </w:rPr>
+        <w:t>):</w:t>
+      </w:r>
+      <w:r>
+        <w:rPr>
+          <w:rFonts w:cs="B Nazanin"/>
+          <w:sz w:val="28"/>
+          <w:szCs w:val="28"/>
+          <w:rtl/>
+          <w:lang w:val="en-US"/>
+        </w:rPr>
+        <w:t xml:space="preserve"> متون استخراج شده به بلوک‌های 1500 کاراکتری با 200 کاراکتر هم‌پوشانی شکسته می‌شوند تا جملات ناقص نمانند.</w:t>
+      </w:r>
+    </w:p>
+    <w:p>
+      <w:pPr>
+        <w:numPr>
+          <w:ilvl w:val="0"/>
+          <w:numId w:val="1"/>
+        </w:numPr>
+        <w:jc w:val="both"/>
+        <w:rPr>
+          <w:rFonts w:cs="B Nazanin"/>
+          <w:sz w:val="28"/>
+          <w:szCs w:val="28"/>
+          <w:rtl/>
+          <w:lang w:val="en-US"/>
+        </w:rPr>
+      </w:pPr>
+      <w:r>
+        <w:rPr>
+          <w:rFonts w:cs="B Nazanin"/>
+          <w:b/>
+          <w:bCs/>
+          <w:sz w:val="28"/>
+          <w:szCs w:val="28"/>
+          <w:rtl/>
+          <w:lang w:val="en-US"/>
+        </w:rPr>
+        <w:t>تولید بردار (</w:t>
+      </w:r>
+      <w:r>
+        <w:rPr>
+          <w:rFonts w:cs="B Nazanin"/>
+          <w:b/>
+          <w:bCs/>
+          <w:sz w:val="28"/>
+          <w:szCs w:val="28"/>
+          <w:lang w:val="en-US"/>
+        </w:rPr>
+        <w:t>Vectorization</w:t>
+      </w:r>
+      <w:r>
+        <w:rPr>
+          <w:rFonts w:cs="B Nazanin"/>
+          <w:b/>
+          <w:bCs/>
+          <w:sz w:val="28"/>
+          <w:szCs w:val="28"/>
+          <w:rtl/>
+          <w:lang w:val="en-US"/>
+        </w:rPr>
+        <w:t>):</w:t>
+      </w:r>
+      <w:r>
+        <w:rPr>
+          <w:rFonts w:cs="B Nazanin"/>
+          <w:sz w:val="28"/>
+          <w:szCs w:val="28"/>
+          <w:rtl/>
+          <w:lang w:val="en-US"/>
+        </w:rPr>
+        <w:t xml:space="preserve"> بلوک‌های متنی توسط مدل </w:t>
+      </w:r>
+      <w:r>
+        <w:rPr>
+          <w:rFonts w:cs="B Nazanin"/>
+          <w:sz w:val="28"/>
+          <w:szCs w:val="28"/>
+          <w:lang w:val="en-US" w:bidi="fa-IR"/>
+        </w:rPr>
+        <w:t>Embedding</w:t>
+      </w:r>
+      <w:r>
+        <w:rPr>
+          <w:rFonts w:cs="B Nazanin"/>
+          <w:sz w:val="28"/>
+          <w:szCs w:val="28"/>
+          <w:rtl/>
+          <w:lang w:val="en-US"/>
+        </w:rPr>
+        <w:t xml:space="preserve"> به بردار تبدیل شده و در وکتور دیتابیس </w:t>
+      </w:r>
+      <w:proofErr w:type="spellStart"/>
+      <w:r>
+        <w:rPr>
+          <w:rFonts w:cs="B Nazanin"/>
+          <w:sz w:val="28"/>
+          <w:szCs w:val="28"/>
+          <w:lang w:val="en-US" w:bidi="fa-IR"/>
+        </w:rPr>
+        <w:t>ChromaDB</w:t>
+      </w:r>
+      <w:proofErr w:type="spellEnd"/>
+      <w:r>
+        <w:rPr>
+          <w:rFonts w:cs="B Nazanin"/>
+          <w:sz w:val="28"/>
+          <w:szCs w:val="28"/>
+          <w:rtl/>
+          <w:lang w:val="en-US"/>
+        </w:rPr>
+        <w:t xml:space="preserve"> (با استفاده از فاصله </w:t>
+      </w:r>
+      <w:r>
+        <w:rPr>
+          <w:rFonts w:cs="B Nazanin"/>
+          <w:sz w:val="28"/>
+          <w:szCs w:val="28"/>
+          <w:lang w:val="en-US" w:bidi="fa-IR"/>
+        </w:rPr>
+        <w:t>Cosine</w:t>
+      </w:r>
+      <w:r>
+        <w:rPr>
+          <w:rFonts w:cs="B Nazanin"/>
+          <w:sz w:val="28"/>
+          <w:szCs w:val="28"/>
+          <w:rtl/>
+          <w:lang w:val="en-US"/>
+        </w:rPr>
+        <w:t>) نمایه می‌شوند.</w:t>
+      </w:r>
+    </w:p>
+    <w:p>
+      <w:pPr>
+        <w:rPr>
+          <w:rFonts w:cs="B Nazanin"/>
+          <w:b/>
+          <w:bCs/>
+          <w:sz w:val="28"/>
+          <w:szCs w:val="28"/>
+          <w:lang w:val="en-US"/>
+        </w:rPr>
+      </w:pPr>
+    </w:p>
+    <w:p>
+      <w:pPr>
+        <w:rPr>
+          <w:rFonts w:cs="B Nazanin"/>
+          <w:b/>
+          <w:bCs/>
+          <w:sz w:val="28"/>
+          <w:szCs w:val="28"/>
+          <w:rtl/>
+          <w:lang w:val="en-US"/>
+        </w:rPr>
+      </w:pPr>
+      <w:r>
+        <w:rPr>
+          <w:rFonts w:cs="B Nazanin"/>
+          <w:b/>
+          <w:bCs/>
+          <w:sz w:val="28"/>
+          <w:szCs w:val="28"/>
+          <w:rtl/>
+          <w:lang w:val="en-US"/>
+        </w:rPr>
+        <w:lastRenderedPageBreak/>
+        <w:t>ج) رابط کاربری و موتور استنتاج (</w:t>
+      </w:r>
+      <w:r>
+        <w:rPr>
+          <w:rFonts w:cs="B Nazanin"/>
+          <w:b/>
+          <w:bCs/>
+          <w:sz w:val="28"/>
+          <w:szCs w:val="28"/>
+          <w:lang w:val="en-US" w:bidi="fa-IR"/>
+        </w:rPr>
+        <w:t>web_interface.py</w:t>
+      </w:r>
+      <w:r>
+        <w:rPr>
+          <w:rFonts w:cs="B Nazanin"/>
+          <w:b/>
+          <w:bCs/>
+          <w:sz w:val="28"/>
+          <w:szCs w:val="28"/>
+          <w:rtl/>
+          <w:lang w:val="en-US"/>
+        </w:rPr>
+        <w:t>)</w:t>
+      </w:r>
+    </w:p>
+    <w:p>
+      <w:pPr>
+        <w:rPr>
+          <w:rFonts w:cs="B Nazanin"/>
+          <w:sz w:val="28"/>
+          <w:szCs w:val="28"/>
+          <w:rtl/>
+          <w:lang w:val="en-US"/>
+        </w:rPr>
+      </w:pPr>
+      <w:r>
+        <w:rPr>
+          <w:rFonts w:cs="B Nazanin"/>
+          <w:sz w:val="28"/>
+          <w:szCs w:val="28"/>
+          <w:rtl/>
+          <w:lang w:val="en-US"/>
+        </w:rPr>
+        <w:t>این بخش واسط ارتباطی بین کاربر و مدل زبانی را فراهم می‌کند:</w:t>
+      </w:r>
+    </w:p>
+    <w:p>
+      <w:pPr>
+        <w:numPr>
+          <w:ilvl w:val="0"/>
+          <w:numId w:val="1"/>
+        </w:numPr>
+        <w:jc w:val="both"/>
+        <w:rPr>
+          <w:rFonts w:cs="B Nazanin"/>
+          <w:sz w:val="28"/>
+          <w:szCs w:val="28"/>
+          <w:rtl/>
+          <w:lang w:val="en-US"/>
+        </w:rPr>
+      </w:pPr>
+      <w:r>
+        <w:rPr>
+          <w:rFonts w:cs="B Nazanin"/>
+          <w:b/>
+          <w:bCs/>
+          <w:sz w:val="28"/>
+          <w:szCs w:val="28"/>
+          <w:rtl/>
+          <w:lang w:val="en-US"/>
+        </w:rPr>
+        <w:t>تکنیک جستجوی پیشرفته (</w:t>
+      </w:r>
+      <w:r>
+        <w:rPr>
+          <w:rFonts w:cs="B Nazanin"/>
+          <w:b/>
+          <w:bCs/>
+          <w:sz w:val="28"/>
+          <w:szCs w:val="28"/>
+          <w:lang w:val="en-US" w:bidi="fa-IR"/>
+        </w:rPr>
+        <w:t>MMR</w:t>
+      </w:r>
+      <w:r>
+        <w:rPr>
+          <w:rFonts w:cs="B Nazanin"/>
+          <w:b/>
+          <w:bCs/>
+          <w:sz w:val="28"/>
+          <w:szCs w:val="28"/>
+          <w:rtl/>
+          <w:lang w:val="en-US"/>
+        </w:rPr>
+        <w:t>):</w:t>
+      </w:r>
+      <w:r>
+        <w:rPr>
+          <w:rFonts w:cs="B Nazanin"/>
+          <w:sz w:val="28"/>
+          <w:szCs w:val="28"/>
+          <w:rtl/>
+          <w:lang w:val="en-US"/>
+        </w:rPr>
+        <w:t xml:space="preserve"> برخلاف جستجوهای ساده، در این سامانه برای جلوگیری از استخراج متون تکراری و افزایش تنوع اطلاعات، از الگوریتم </w:t>
+      </w:r>
+      <w:r>
+        <w:rPr>
+          <w:rFonts w:cs="B Nazanin"/>
+          <w:sz w:val="28"/>
+          <w:szCs w:val="28"/>
+          <w:lang w:val="en-US" w:bidi="fa-IR"/>
+        </w:rPr>
+        <w:t>Maximal Marginal Relevance (MMR)</w:t>
+      </w:r>
+      <w:r>
+        <w:rPr>
+          <w:rFonts w:cs="B Nazanin"/>
+          <w:sz w:val="28"/>
+          <w:szCs w:val="28"/>
+          <w:rtl/>
+          <w:lang w:val="en-US"/>
+        </w:rPr>
+        <w:t xml:space="preserve"> استفاده شده است. این الگوریتم ابتدا 20 قطعه مرتبط را پیدا کرده و سپس 8 قطعه‌ای که بیشترین ارتباط و در عین حال کمترین شباهت به یکدیگر را دارند، گلچین می‌کند.</w:t>
+      </w:r>
+    </w:p>
+    <w:p>
+      <w:pPr>
+        <w:numPr>
+          <w:ilvl w:val="0"/>
+          <w:numId w:val="1"/>
+        </w:numPr>
+        <w:jc w:val="both"/>
+        <w:rPr>
+          <w:rFonts w:cs="B Nazanin"/>
+          <w:sz w:val="28"/>
+          <w:szCs w:val="28"/>
+          <w:rtl/>
+          <w:lang w:val="en-US"/>
+        </w:rPr>
+      </w:pPr>
+      <w:r>
+        <w:rPr>
+          <w:rFonts w:cs="B Nazanin"/>
+          <w:b/>
+          <w:bCs/>
+          <w:sz w:val="28"/>
+          <w:szCs w:val="28"/>
+          <w:rtl/>
+          <w:lang w:val="en-US"/>
+        </w:rPr>
+        <w:t>تولید پاسخ استدلالی:</w:t>
+      </w:r>
+      <w:r>
+        <w:rPr>
+          <w:rFonts w:cs="B Nazanin"/>
+          <w:sz w:val="28"/>
+          <w:szCs w:val="28"/>
+          <w:rtl/>
+          <w:lang w:val="en-US"/>
+        </w:rPr>
+        <w:t xml:space="preserve"> متون گلچین شده به همراه پرسش کاربر (پس از نرمال‌سازی) به مدل زبانی </w:t>
+      </w:r>
+      <w:r>
+        <w:rPr>
+          <w:rFonts w:cs="B Nazanin"/>
+          <w:sz w:val="28"/>
+          <w:szCs w:val="28"/>
+          <w:lang w:val="en-US" w:bidi="fa-IR"/>
+        </w:rPr>
+        <w:t>llama-3.3-70b-versatile</w:t>
+      </w:r>
+      <w:r>
+        <w:rPr>
+          <w:rFonts w:cs="B Nazanin"/>
+          <w:sz w:val="28"/>
+          <w:szCs w:val="28"/>
+          <w:rtl/>
+          <w:lang w:val="en-US"/>
+        </w:rPr>
+        <w:t xml:space="preserve"> از طریق </w:t>
+      </w:r>
+      <w:proofErr w:type="spellStart"/>
+      <w:r>
+        <w:rPr>
+          <w:rFonts w:cs="B Nazanin"/>
+          <w:sz w:val="28"/>
+          <w:szCs w:val="28"/>
+          <w:lang w:val="en-US" w:bidi="fa-IR"/>
+        </w:rPr>
+        <w:t>Groq</w:t>
+      </w:r>
+      <w:proofErr w:type="spellEnd"/>
+      <w:r>
+        <w:rPr>
+          <w:rFonts w:cs="B Nazanin"/>
+          <w:sz w:val="28"/>
+          <w:szCs w:val="28"/>
+          <w:lang w:val="en-US" w:bidi="fa-IR"/>
+        </w:rPr>
+        <w:t xml:space="preserve"> API</w:t>
+      </w:r>
+      <w:r>
+        <w:rPr>
+          <w:rFonts w:cs="B Nazanin"/>
+          <w:sz w:val="28"/>
+          <w:szCs w:val="28"/>
+          <w:rtl/>
+          <w:lang w:val="en-US"/>
+        </w:rPr>
+        <w:t xml:space="preserve"> ارسال می‌شوند. پرامپت (</w:t>
+      </w:r>
+      <w:r>
+        <w:rPr>
+          <w:rFonts w:cs="B Nazanin"/>
+          <w:sz w:val="28"/>
+          <w:szCs w:val="28"/>
+          <w:lang w:val="en-US" w:bidi="fa-IR"/>
+        </w:rPr>
+        <w:t>Prompt</w:t>
+      </w:r>
+      <w:r>
+        <w:rPr>
+          <w:rFonts w:cs="B Nazanin"/>
+          <w:sz w:val="28"/>
+          <w:szCs w:val="28"/>
+          <w:rtl/>
+          <w:lang w:val="en-US"/>
+        </w:rPr>
+        <w:t>) سیستم به گونه‌ای تنظیم شده است که پاسخی تشریحی و کامل ارائه دهد و در صورت نیافتن ارتباط معنایی، از پاسخ دادن خودداری کند.</w:t>
+      </w:r>
+    </w:p>
+    <w:p>
+      <w:pPr>
+        <w:numPr>
+          <w:ilvl w:val="0"/>
+          <w:numId w:val="1"/>
+        </w:numPr>
+        <w:jc w:val="both"/>
+        <w:rPr>
+          <w:rFonts w:cs="B Nazanin"/>
+          <w:sz w:val="28"/>
+          <w:szCs w:val="28"/>
+          <w:rtl/>
+          <w:lang w:val="en-US"/>
+        </w:rPr>
+      </w:pPr>
+      <w:r>
+        <w:rPr>
+          <w:rFonts w:cs="B Nazanin"/>
+          <w:b/>
+          <w:bCs/>
+          <w:sz w:val="28"/>
+          <w:szCs w:val="28"/>
+          <w:rtl/>
+          <w:lang w:val="en-US"/>
+        </w:rPr>
+        <w:t>طراحی بصری (</w:t>
+      </w:r>
+      <w:r>
+        <w:rPr>
+          <w:rFonts w:cs="B Nazanin"/>
+          <w:b/>
+          <w:bCs/>
+          <w:sz w:val="28"/>
+          <w:szCs w:val="28"/>
+          <w:lang w:val="en-US" w:bidi="fa-IR"/>
+        </w:rPr>
+        <w:t>UI</w:t>
+      </w:r>
+      <w:r>
+        <w:rPr>
+          <w:rFonts w:cs="B Nazanin"/>
+          <w:b/>
+          <w:bCs/>
+          <w:sz w:val="28"/>
+          <w:szCs w:val="28"/>
+          <w:rtl/>
+          <w:lang w:val="en-US"/>
+        </w:rPr>
+        <w:t>):</w:t>
+      </w:r>
+      <w:r>
+        <w:rPr>
+          <w:rFonts w:cs="B Nazanin"/>
+          <w:sz w:val="28"/>
+          <w:szCs w:val="28"/>
+          <w:rtl/>
+          <w:lang w:val="en-US"/>
+        </w:rPr>
+        <w:t xml:space="preserve"> محیط </w:t>
+      </w:r>
+      <w:r>
+        <w:rPr>
+          <w:rFonts w:cs="B Nazanin"/>
+          <w:b/>
+          <w:bCs/>
+          <w:sz w:val="28"/>
+          <w:szCs w:val="28"/>
+          <w:rtl/>
+          <w:lang w:val="en-US"/>
+        </w:rPr>
+        <w:t>گرافیکی</w:t>
+      </w:r>
+      <w:r>
+        <w:rPr>
+          <w:rFonts w:cs="B Nazanin"/>
+          <w:sz w:val="28"/>
+          <w:szCs w:val="28"/>
+          <w:rtl/>
+          <w:lang w:val="en-US"/>
+        </w:rPr>
+        <w:t xml:space="preserve"> با استفاده از </w:t>
+      </w:r>
+      <w:proofErr w:type="spellStart"/>
+      <w:r>
+        <w:rPr>
+          <w:rFonts w:cs="B Nazanin"/>
+          <w:sz w:val="28"/>
+          <w:szCs w:val="28"/>
+          <w:lang w:val="en-US" w:bidi="fa-IR"/>
+        </w:rPr>
+        <w:t>Streamlit</w:t>
+      </w:r>
+      <w:proofErr w:type="spellEnd"/>
+      <w:r>
+        <w:rPr>
+          <w:rFonts w:cs="B Nazanin"/>
+          <w:sz w:val="28"/>
+          <w:szCs w:val="28"/>
+          <w:rtl/>
+          <w:lang w:val="en-US"/>
+        </w:rPr>
+        <w:t xml:space="preserve"> توسعه یافته و با کدهای سفارشی </w:t>
+      </w:r>
+      <w:r>
+        <w:rPr>
+          <w:rFonts w:cs="B Nazanin"/>
+          <w:sz w:val="28"/>
+          <w:szCs w:val="28"/>
+          <w:lang w:val="en-US" w:bidi="fa-IR"/>
+        </w:rPr>
+        <w:t>CSS</w:t>
+      </w:r>
+      <w:r>
+        <w:rPr>
+          <w:rFonts w:cs="B Nazanin"/>
+          <w:sz w:val="28"/>
+          <w:szCs w:val="28"/>
+          <w:rtl/>
+          <w:lang w:val="en-US"/>
+        </w:rPr>
+        <w:t>، محیطی تیره (</w:t>
+      </w:r>
+      <w:r>
+        <w:rPr>
+          <w:rFonts w:cs="B Nazanin"/>
+          <w:sz w:val="28"/>
+          <w:szCs w:val="28"/>
+          <w:lang w:val="en-US" w:bidi="fa-IR"/>
+        </w:rPr>
+        <w:t>Dark Mode</w:t>
+      </w:r>
+      <w:r>
+        <w:rPr>
+          <w:rFonts w:cs="B Nazanin"/>
+          <w:sz w:val="28"/>
+          <w:szCs w:val="28"/>
+          <w:rtl/>
+          <w:lang w:val="en-US"/>
+        </w:rPr>
+        <w:t>)، کاملاً راست‌چین و کاربرپسند برای نمایش پاسخ‌ها و ارجاعات (شماره سند و صفحه) ایجاد شده است.</w:t>
+      </w:r>
+    </w:p>
+    <w:p>
+      <w:pPr>
+        <w:rPr>
+          <w:rFonts w:cs="B Nazanin"/>
+          <w:b/>
+          <w:bCs/>
+          <w:sz w:val="32"/>
+          <w:szCs w:val="32"/>
+          <w:rtl/>
+          <w:lang w:val="en-US"/>
+        </w:rPr>
+      </w:pPr>
+      <w:r>
+        <w:rPr>
+          <w:rFonts w:cs="B Nazanin"/>
+          <w:b/>
+          <w:bCs/>
+          <w:sz w:val="32"/>
+          <w:szCs w:val="32"/>
+          <w:rtl/>
+          <w:lang w:val="en-US" w:bidi="fa-IR"/>
+        </w:rPr>
+        <w:t xml:space="preserve">۳. </w:t>
+      </w:r>
+      <w:r>
+        <w:rPr>
+          <w:rFonts w:cs="B Nazanin"/>
+          <w:b/>
+          <w:bCs/>
+          <w:sz w:val="32"/>
+          <w:szCs w:val="32"/>
+          <w:rtl/>
+          <w:lang w:val="en-US"/>
+        </w:rPr>
+        <w:t>نمایش محیط برنامه</w:t>
+      </w:r>
+    </w:p>
+    <w:p>
+      <w:pPr>
+        <w:jc w:val="both"/>
+        <w:rPr>
+          <w:rFonts w:cs="B Nazanin"/>
+          <w:sz w:val="28"/>
+          <w:szCs w:val="28"/>
+          <w:rtl/>
+          <w:lang w:val="en-US"/>
+        </w:rPr>
+      </w:pPr>
+      <w:r>
+        <w:rPr>
+          <w:rFonts w:cs="B Nazanin"/>
+          <w:sz w:val="28"/>
+          <w:szCs w:val="28"/>
+          <w:rtl/>
+          <w:lang w:val="en-US"/>
+        </w:rPr>
+        <w:t>رابط کاربری سیستم با تمرکز بر سادگی و کارایی طراحی شده است. کاربر در بالای صفحه یک کادر جستجو مشاهده می‌کند. پس از ثبت پرسش، سیستم در پس‌زمینه شروع به تحلیل ده‌ها صفحه آیین‌نامه کرده و نتیجه را در یک کادر سبز رنگ (</w:t>
+      </w:r>
+      <w:r>
+        <w:rPr>
+          <w:rFonts w:cs="B Nazanin"/>
+          <w:sz w:val="28"/>
+          <w:szCs w:val="28"/>
+          <w:lang w:val="en-US" w:bidi="fa-IR"/>
+        </w:rPr>
+        <w:t>Success Box</w:t>
+      </w:r>
+      <w:r>
+        <w:rPr>
+          <w:rFonts w:cs="B Nazanin"/>
+          <w:sz w:val="28"/>
+          <w:szCs w:val="28"/>
+          <w:rtl/>
+          <w:lang w:val="en-US"/>
+        </w:rPr>
+        <w:t>) نمایش می‌دهد. یکی از ویژگی‌های بارز سیستم، نمایش دقیق مستندات ارجاعی در پایین پاسخ است که امکان راستی‌آزمایی را برای کاربر فراهم می‌کند.</w:t>
+      </w:r>
+    </w:p>
+    <w:p>
+      <w:pPr>
+        <w:rPr>
+          <w:rFonts w:cs="B Nazanin"/>
+          <w:sz w:val="28"/>
+          <w:szCs w:val="28"/>
+          <w:rtl/>
+          <w:lang w:val="en-US"/>
+        </w:rPr>
+      </w:pPr>
+      <w:r>
+        <w:rPr>
+          <w:rFonts w:cs="B Nazanin"/>
+          <w:sz w:val="28"/>
+          <w:szCs w:val="28"/>
+          <w:lang w:val="en-US" w:bidi="fa-IR"/>
+        </w:rPr>
+        <w:t>[</w:t>
+      </w:r>
+      <w:r>
+        <w:rPr>
+          <w:rFonts w:cs="B Nazanin"/>
+          <w:sz w:val="28"/>
+          <w:szCs w:val="28"/>
+          <w:rtl/>
+          <w:lang w:val="en-US"/>
+        </w:rPr>
+        <w:t>در این قسمت، یک اسکرین‌شات از محیط تیره برنامه که در آن هوش مصنوعی به یک پرسش پاسخ داده و منابع آن در پایین راست‌چین شده‌اند، قرار دهید</w:t>
+      </w:r>
+      <w:r>
+        <w:rPr>
+          <w:rFonts w:cs="B Nazanin"/>
+          <w:sz w:val="28"/>
+          <w:szCs w:val="28"/>
+          <w:lang w:val="en-US" w:bidi="fa-IR"/>
+        </w:rPr>
+        <w:t>]</w:t>
+      </w:r>
+    </w:p>
+    <w:p>
+      <w:pPr>
+        <w:rPr>
+          <w:rFonts w:cs="B Nazanin"/>
+          <w:b/>
+          <w:bCs/>
+          <w:sz w:val="32"/>
+          <w:szCs w:val="32"/>
+          <w:lang w:val="en-US" w:bidi="fa-IR"/>
+        </w:rPr>
+      </w:pPr>
+      <w:r>
+        <w:rPr>
+          <w:rFonts w:cs="B Nazanin"/>
+          <w:b/>
+          <w:bCs/>
+          <w:sz w:val="32"/>
+          <w:szCs w:val="32"/>
+          <w:rtl/>
+          <w:lang w:val="en-US" w:bidi="fa-IR"/>
+        </w:rPr>
+        <w:t xml:space="preserve">۴. </w:t>
+      </w:r>
+      <w:r>
+        <w:rPr>
+          <w:rFonts w:cs="B Nazanin"/>
+          <w:b/>
+          <w:bCs/>
+          <w:sz w:val="32"/>
+          <w:szCs w:val="32"/>
+          <w:rtl/>
+          <w:lang w:val="en-US"/>
+        </w:rPr>
+        <w:t>راهنمای نصب و راه‌اندازی</w:t>
+      </w:r>
+    </w:p>
+    <w:p>
+      <w:pPr>
+        <w:rPr>
+          <w:rFonts w:cs="B Nazanin"/>
+          <w:sz w:val="28"/>
+          <w:szCs w:val="28"/>
+          <w:rtl/>
+          <w:lang w:val="en-US"/>
+        </w:rPr>
+      </w:pPr>
+      <w:r>
+        <w:rPr>
+          <w:rFonts w:cs="B Nazanin"/>
+          <w:sz w:val="28"/>
+          <w:szCs w:val="28"/>
+          <w:rtl/>
+          <w:lang w:val="en-US"/>
+        </w:rPr>
+        <w:t>برای استقرار و اجرای سامانه بر روی محیط محلی، مراحل زیر باید انجام شود:</w:t>
+      </w:r>
+    </w:p>
+    <w:p>
+      <w:pPr>
+        <w:numPr>
+          <w:ilvl w:val="0"/>
+          <w:numId w:val="3"/>
+        </w:numPr>
+        <w:jc w:val="both"/>
+        <w:rPr>
+          <w:rFonts w:cs="B Nazanin"/>
+          <w:sz w:val="28"/>
+          <w:szCs w:val="28"/>
+          <w:rtl/>
+          <w:lang w:val="en-US"/>
+        </w:rPr>
+      </w:pPr>
+      <w:r>
+        <w:rPr>
+          <w:rFonts w:cs="B Nazanin"/>
+          <w:b/>
+          <w:bCs/>
+          <w:sz w:val="28"/>
+          <w:szCs w:val="28"/>
+          <w:rtl/>
+          <w:lang w:val="en-US"/>
+        </w:rPr>
+        <w:t>نصب وابستگی‌ها:</w:t>
+      </w:r>
+      <w:r>
+        <w:rPr>
+          <w:rFonts w:cs="B Nazanin"/>
+          <w:sz w:val="28"/>
+          <w:szCs w:val="28"/>
+          <w:rtl/>
+          <w:lang w:val="en-US"/>
+        </w:rPr>
+        <w:t xml:space="preserve"> نصب کتابخانه‌های مورد نیاز از جمله </w:t>
+      </w:r>
+      <w:proofErr w:type="spellStart"/>
+      <w:r>
+        <w:rPr>
+          <w:rFonts w:cs="B Nazanin"/>
+          <w:sz w:val="28"/>
+          <w:szCs w:val="28"/>
+          <w:lang w:val="en-US" w:bidi="fa-IR"/>
+        </w:rPr>
+        <w:t>streamlit</w:t>
+      </w:r>
+      <w:proofErr w:type="spellEnd"/>
+      <w:r>
+        <w:rPr>
+          <w:rFonts w:cs="B Nazanin"/>
+          <w:sz w:val="28"/>
+          <w:szCs w:val="28"/>
+          <w:rtl/>
+          <w:lang w:val="en-US"/>
+        </w:rPr>
+        <w:t xml:space="preserve">، </w:t>
+      </w:r>
+      <w:proofErr w:type="spellStart"/>
+      <w:r>
+        <w:rPr>
+          <w:rFonts w:cs="B Nazanin"/>
+          <w:sz w:val="28"/>
+          <w:szCs w:val="28"/>
+          <w:lang w:val="en-US" w:bidi="fa-IR"/>
+        </w:rPr>
+        <w:t>langchain</w:t>
+      </w:r>
+      <w:proofErr w:type="spellEnd"/>
+      <w:r>
+        <w:rPr>
+          <w:rFonts w:cs="B Nazanin"/>
+          <w:sz w:val="28"/>
+          <w:szCs w:val="28"/>
+          <w:rtl/>
+          <w:lang w:val="en-US"/>
+        </w:rPr>
+        <w:t xml:space="preserve">، </w:t>
+      </w:r>
+      <w:proofErr w:type="spellStart"/>
+      <w:r>
+        <w:rPr>
+          <w:rFonts w:cs="B Nazanin"/>
+          <w:sz w:val="28"/>
+          <w:szCs w:val="28"/>
+          <w:lang w:val="en-US" w:bidi="fa-IR"/>
+        </w:rPr>
+        <w:t>chromadb</w:t>
+      </w:r>
+      <w:proofErr w:type="spellEnd"/>
+      <w:r>
+        <w:rPr>
+          <w:rFonts w:cs="B Nazanin"/>
+          <w:sz w:val="28"/>
+          <w:szCs w:val="28"/>
+          <w:rtl/>
+          <w:lang w:val="en-US"/>
+        </w:rPr>
+        <w:t xml:space="preserve">، </w:t>
+      </w:r>
+      <w:proofErr w:type="spellStart"/>
+      <w:r>
+        <w:rPr>
+          <w:rFonts w:cs="B Nazanin"/>
+          <w:sz w:val="28"/>
+          <w:szCs w:val="28"/>
+          <w:lang w:val="en-US" w:bidi="fa-IR"/>
+        </w:rPr>
+        <w:t>hazm</w:t>
+      </w:r>
+      <w:proofErr w:type="spellEnd"/>
+      <w:r>
+        <w:rPr>
+          <w:rFonts w:cs="B Nazanin"/>
+          <w:sz w:val="28"/>
+          <w:szCs w:val="28"/>
+          <w:rtl/>
+          <w:lang w:val="en-US"/>
+        </w:rPr>
+        <w:t xml:space="preserve">، </w:t>
+      </w:r>
+      <w:r>
+        <w:rPr>
+          <w:rFonts w:cs="B Nazanin"/>
+          <w:sz w:val="28"/>
+          <w:szCs w:val="28"/>
+          <w:lang w:val="en-US" w:bidi="fa-IR"/>
+        </w:rPr>
+        <w:t>pdf2image</w:t>
+      </w:r>
+      <w:r>
+        <w:rPr>
+          <w:rFonts w:cs="B Nazanin"/>
+          <w:sz w:val="28"/>
+          <w:szCs w:val="28"/>
+          <w:rtl/>
+          <w:lang w:val="en-US"/>
+        </w:rPr>
+        <w:t xml:space="preserve"> و </w:t>
+      </w:r>
+      <w:proofErr w:type="spellStart"/>
+      <w:r>
+        <w:rPr>
+          <w:rFonts w:cs="B Nazanin"/>
+          <w:sz w:val="28"/>
+          <w:szCs w:val="28"/>
+          <w:lang w:val="en-US" w:bidi="fa-IR"/>
+        </w:rPr>
+        <w:t>pytesseract</w:t>
+      </w:r>
+      <w:proofErr w:type="spellEnd"/>
+      <w:r>
+        <w:rPr>
+          <w:rFonts w:cs="B Nazanin"/>
+          <w:sz w:val="28"/>
+          <w:szCs w:val="28"/>
+          <w:rtl/>
+          <w:lang w:val="en-US"/>
+        </w:rPr>
+        <w:t xml:space="preserve"> با استفاده از مدیر بسته‌ی </w:t>
+      </w:r>
+      <w:r>
+        <w:rPr>
+          <w:rFonts w:cs="B Nazanin"/>
+          <w:sz w:val="28"/>
+          <w:szCs w:val="28"/>
+          <w:lang w:val="en-US" w:bidi="fa-IR"/>
+        </w:rPr>
+        <w:t>pip</w:t>
+      </w:r>
+      <w:r>
+        <w:rPr>
+          <w:rFonts w:cs="B Nazanin"/>
+          <w:sz w:val="28"/>
+          <w:szCs w:val="28"/>
+          <w:rtl/>
+          <w:lang w:val="en-US"/>
+        </w:rPr>
+        <w:t>.</w:t>
+      </w:r>
+    </w:p>
+    <w:p>
+      <w:pPr>
+        <w:numPr>
+          <w:ilvl w:val="0"/>
+          <w:numId w:val="3"/>
+        </w:numPr>
+        <w:jc w:val="both"/>
+        <w:rPr>
+          <w:rFonts w:cs="B Nazanin"/>
+          <w:sz w:val="28"/>
+          <w:szCs w:val="28"/>
+          <w:rtl/>
+          <w:lang w:val="en-US"/>
+        </w:rPr>
+      </w:pPr>
+      <w:r>
+        <w:rPr>
+          <w:rFonts w:cs="B Nazanin"/>
+          <w:b/>
+          <w:bCs/>
+          <w:sz w:val="28"/>
+          <w:szCs w:val="28"/>
+          <w:rtl/>
+          <w:lang w:val="en-US"/>
+        </w:rPr>
+        <w:t>پیش‌نیازهای سیستمی:</w:t>
+      </w:r>
+      <w:r>
+        <w:rPr>
+          <w:rFonts w:cs="B Nazanin"/>
+          <w:sz w:val="28"/>
+          <w:szCs w:val="28"/>
+          <w:rtl/>
+          <w:lang w:val="en-US"/>
+        </w:rPr>
+        <w:t xml:space="preserve"> نصب نرم‌افزار </w:t>
+      </w:r>
+      <w:r>
+        <w:rPr>
+          <w:rFonts w:cs="B Nazanin"/>
+          <w:sz w:val="28"/>
+          <w:szCs w:val="28"/>
+          <w:lang w:val="en-US" w:bidi="fa-IR"/>
+        </w:rPr>
+        <w:t>Tesseract</w:t>
+      </w:r>
+      <w:r>
+        <w:rPr>
+          <w:rFonts w:cs="B Nazanin"/>
+          <w:sz w:val="28"/>
+          <w:szCs w:val="28"/>
+          <w:rtl/>
+          <w:lang w:val="en-US"/>
+        </w:rPr>
+        <w:t xml:space="preserve"> (به همراه داده‌های زبان </w:t>
+      </w:r>
+      <w:proofErr w:type="spellStart"/>
+      <w:r>
+        <w:rPr>
+          <w:rFonts w:cs="B Nazanin"/>
+          <w:sz w:val="28"/>
+          <w:szCs w:val="28"/>
+          <w:lang w:val="en-US" w:bidi="fa-IR"/>
+        </w:rPr>
+        <w:t>fas</w:t>
+      </w:r>
+      <w:proofErr w:type="spellEnd"/>
+      <w:r>
+        <w:rPr>
+          <w:rFonts w:cs="B Nazanin"/>
+          <w:sz w:val="28"/>
+          <w:szCs w:val="28"/>
+          <w:rtl/>
+          <w:lang w:val="en-US"/>
+        </w:rPr>
+        <w:t xml:space="preserve">) و </w:t>
+      </w:r>
+      <w:r>
+        <w:rPr>
+          <w:rFonts w:cs="B Nazanin"/>
+          <w:sz w:val="28"/>
+          <w:szCs w:val="28"/>
+          <w:lang w:val="en-US" w:bidi="fa-IR"/>
+        </w:rPr>
+        <w:t>Poppler</w:t>
+      </w:r>
+      <w:r>
+        <w:rPr>
+          <w:rFonts w:cs="B Nazanin"/>
+          <w:sz w:val="28"/>
+          <w:szCs w:val="28"/>
+          <w:rtl/>
+          <w:lang w:val="en-US"/>
+        </w:rPr>
+        <w:t xml:space="preserve"> روی سیستم‌عامل میزبان و افزودن مسیر اجرای آن‌ها به متغیرهای محیطی سیستم (</w:t>
+      </w:r>
+      <w:r>
+        <w:rPr>
+          <w:rFonts w:cs="B Nazanin"/>
+          <w:sz w:val="28"/>
+          <w:szCs w:val="28"/>
+          <w:lang w:val="en-US" w:bidi="fa-IR"/>
+        </w:rPr>
+        <w:t>PATH</w:t>
+      </w:r>
+      <w:r>
+        <w:rPr>
+          <w:rFonts w:cs="B Nazanin"/>
+          <w:sz w:val="28"/>
+          <w:szCs w:val="28"/>
+          <w:rtl/>
+          <w:lang w:val="en-US"/>
+        </w:rPr>
+        <w:t>).</w:t>
+      </w:r>
+    </w:p>
+    <w:p>
+      <w:pPr>
+        <w:numPr>
+          <w:ilvl w:val="0"/>
+          <w:numId w:val="3"/>
+        </w:numPr>
+        <w:jc w:val="both"/>
+        <w:rPr>
+          <w:rFonts w:cs="B Nazanin"/>
+          <w:sz w:val="28"/>
+          <w:szCs w:val="28"/>
+          <w:rtl/>
+          <w:lang w:val="en-US"/>
+        </w:rPr>
+      </w:pPr>
+      <w:r>
+        <w:rPr>
+          <w:rFonts w:cs="B Nazanin"/>
+          <w:b/>
+          <w:bCs/>
+          <w:sz w:val="28"/>
+          <w:szCs w:val="28"/>
+          <w:rtl/>
+          <w:lang w:val="en-US"/>
+        </w:rPr>
+        <w:lastRenderedPageBreak/>
+        <w:t>ساخت پایگاه دانش:</w:t>
+      </w:r>
+      <w:r>
+        <w:rPr>
+          <w:rFonts w:cs="B Nazanin"/>
+          <w:sz w:val="28"/>
+          <w:szCs w:val="28"/>
+          <w:rtl/>
+          <w:lang w:val="en-US"/>
+        </w:rPr>
+        <w:t xml:space="preserve"> قرار دادن فایل‌های آیین‌نامه در پوشه‌ی </w:t>
+      </w:r>
+      <w:proofErr w:type="spellStart"/>
+      <w:r>
+        <w:rPr>
+          <w:rFonts w:cs="B Nazanin"/>
+          <w:sz w:val="28"/>
+          <w:szCs w:val="28"/>
+          <w:lang w:val="en-US" w:bidi="fa-IR"/>
+        </w:rPr>
+        <w:t>pdf_docs</w:t>
+      </w:r>
+      <w:proofErr w:type="spellEnd"/>
+      <w:r>
+        <w:rPr>
+          <w:rFonts w:cs="B Nazanin"/>
+          <w:sz w:val="28"/>
+          <w:szCs w:val="28"/>
+          <w:rtl/>
+          <w:lang w:val="en-US"/>
+        </w:rPr>
+        <w:t xml:space="preserve"> و سپس اجرای اسکریپت </w:t>
+      </w:r>
+      <w:r>
+        <w:rPr>
+          <w:rFonts w:cs="B Nazanin"/>
+          <w:sz w:val="28"/>
+          <w:szCs w:val="28"/>
+          <w:lang w:val="en-US" w:bidi="fa-IR"/>
+        </w:rPr>
+        <w:t>python data_processor-3.py</w:t>
+      </w:r>
+      <w:r>
+        <w:rPr>
+          <w:rFonts w:cs="B Nazanin"/>
+          <w:sz w:val="28"/>
+          <w:szCs w:val="28"/>
+          <w:rtl/>
+          <w:lang w:val="en-US"/>
+        </w:rPr>
+        <w:t xml:space="preserve"> در ترمینال جهت ساخت وکتور دیتابیس در پوشه‌ی </w:t>
+      </w:r>
+      <w:proofErr w:type="spellStart"/>
+      <w:r>
+        <w:rPr>
+          <w:rFonts w:cs="B Nazanin"/>
+          <w:sz w:val="28"/>
+          <w:szCs w:val="28"/>
+          <w:lang w:val="en-US" w:bidi="fa-IR"/>
+        </w:rPr>
+        <w:t>knowledge_db</w:t>
+      </w:r>
+      <w:proofErr w:type="spellEnd"/>
+      <w:r>
+        <w:rPr>
+          <w:rFonts w:cs="B Nazanin"/>
+          <w:sz w:val="28"/>
+          <w:szCs w:val="28"/>
+          <w:rtl/>
+          <w:lang w:val="en-US"/>
+        </w:rPr>
+        <w:t>.</w:t>
+      </w:r>
+    </w:p>
+    <w:p>
+      <w:pPr>
+        <w:numPr>
+          <w:ilvl w:val="0"/>
+          <w:numId w:val="3"/>
+        </w:numPr>
+        <w:jc w:val="both"/>
+        <w:rPr>
+          <w:rFonts w:cs="B Nazanin"/>
+          <w:sz w:val="28"/>
+          <w:szCs w:val="28"/>
+          <w:rtl/>
+          <w:lang w:val="en-US"/>
+        </w:rPr>
+      </w:pPr>
+      <w:r>
+        <w:rPr>
+          <w:rFonts w:cs="B Nazanin"/>
+          <w:b/>
+          <w:bCs/>
+          <w:sz w:val="28"/>
+          <w:szCs w:val="28"/>
+          <w:rtl/>
+          <w:lang w:val="en-US"/>
+        </w:rPr>
+        <w:t>اجرای سرویس وب:</w:t>
+      </w:r>
+      <w:r>
+        <w:rPr>
+          <w:rFonts w:cs="B Nazanin"/>
+          <w:sz w:val="28"/>
+          <w:szCs w:val="28"/>
+          <w:rtl/>
+          <w:lang w:val="en-US"/>
+        </w:rPr>
+        <w:t xml:space="preserve"> اجرای دستور </w:t>
+      </w:r>
+      <w:proofErr w:type="spellStart"/>
+      <w:r>
+        <w:rPr>
+          <w:rFonts w:cs="B Nazanin"/>
+          <w:sz w:val="28"/>
+          <w:szCs w:val="28"/>
+          <w:lang w:val="en-US" w:bidi="fa-IR"/>
+        </w:rPr>
+        <w:t>streamlit</w:t>
+      </w:r>
+      <w:proofErr w:type="spellEnd"/>
+      <w:r>
+        <w:rPr>
+          <w:rFonts w:cs="B Nazanin"/>
+          <w:sz w:val="28"/>
+          <w:szCs w:val="28"/>
+          <w:lang w:val="en-US" w:bidi="fa-IR"/>
+        </w:rPr>
+        <w:t xml:space="preserve"> run web_interface-2.py</w:t>
+      </w:r>
+      <w:r>
+        <w:rPr>
+          <w:rFonts w:cs="B Nazanin"/>
+          <w:sz w:val="28"/>
+          <w:szCs w:val="28"/>
+          <w:rtl/>
+          <w:lang w:val="en-US"/>
+        </w:rPr>
+        <w:t xml:space="preserve"> در ترمینال. پس از اجرای این دستور، سامانه در مرورگر (آدرس </w:t>
+      </w:r>
+      <w:r>
+        <w:rPr>
+          <w:rFonts w:cs="B Nazanin"/>
+          <w:sz w:val="28"/>
+          <w:szCs w:val="28"/>
+          <w:lang w:val="en-US" w:bidi="fa-IR"/>
+        </w:rPr>
+        <w:t>localhost</w:t>
+      </w:r>
+      <w:r>
+        <w:rPr>
+          <w:rFonts w:cs="B Nazanin"/>
+          <w:sz w:val="28"/>
+          <w:szCs w:val="28"/>
+          <w:rtl/>
+          <w:lang w:val="en-US"/>
+        </w:rPr>
+        <w:t>) در دسترس خواهد بود.</w:t>
+      </w:r>
+    </w:p>
+    <w:p>
+      <w:pPr>
+        <w:rPr>
+          <w:rFonts w:cs="B Nazanin"/>
+          <w:b/>
+          <w:bCs/>
+          <w:sz w:val="32"/>
+          <w:szCs w:val="32"/>
+          <w:rtl/>
+          <w:lang w:val="en-US"/>
+        </w:rPr>
+      </w:pPr>
+      <w:r>
+        <w:rPr>
+          <w:rFonts w:cs="B Nazanin"/>
+          <w:b/>
+          <w:bCs/>
+          <w:sz w:val="32"/>
+          <w:szCs w:val="32"/>
+          <w:rtl/>
+          <w:lang w:val="en-US" w:bidi="fa-IR"/>
+        </w:rPr>
+        <w:t xml:space="preserve">۵. </w:t>
+      </w:r>
+      <w:r>
+        <w:rPr>
+          <w:rFonts w:cs="B Nazanin"/>
+          <w:b/>
+          <w:bCs/>
+          <w:sz w:val="32"/>
+          <w:szCs w:val="32"/>
+          <w:rtl/>
+          <w:lang w:val="en-US"/>
+        </w:rPr>
+        <w:t>نتیجه‌گیری</w:t>
+      </w:r>
+    </w:p>
+    <w:p>
+      <w:pPr>
+        <w:jc w:val="both"/>
+        <w:rPr>
+          <w:rFonts w:cs="B Nazanin"/>
+          <w:sz w:val="28"/>
+          <w:szCs w:val="28"/>
+          <w:rtl/>
+          <w:lang w:val="en-US"/>
+        </w:rPr>
+      </w:pPr>
+      <w:r>
+        <w:rPr>
+          <w:rFonts w:cs="B Nazanin"/>
+          <w:sz w:val="28"/>
+          <w:szCs w:val="28"/>
+          <w:rtl/>
+          <w:lang w:val="en-US"/>
+        </w:rPr>
+        <w:t>این پروژه نشان داد که ترکیب تکنیک‌های پردازش تصویر (</w:t>
+      </w:r>
+      <w:r>
+        <w:rPr>
+          <w:rFonts w:cs="B Nazanin"/>
+          <w:sz w:val="28"/>
+          <w:szCs w:val="28"/>
+          <w:lang w:val="en-US" w:bidi="fa-IR"/>
+        </w:rPr>
+        <w:t>OCR</w:t>
+      </w:r>
+      <w:r>
+        <w:rPr>
+          <w:rFonts w:cs="B Nazanin"/>
+          <w:sz w:val="28"/>
+          <w:szCs w:val="28"/>
+          <w:rtl/>
+          <w:lang w:val="en-US"/>
+        </w:rPr>
+        <w:t xml:space="preserve">)، نرمال‌سازی متون فارسی، و الگوریتم‌های پیشرفته بازیابی نظیر </w:t>
+      </w:r>
+      <w:r>
+        <w:rPr>
+          <w:rFonts w:cs="B Nazanin"/>
+          <w:sz w:val="28"/>
+          <w:szCs w:val="28"/>
+          <w:lang w:val="en-US" w:bidi="fa-IR"/>
+        </w:rPr>
+        <w:t>MMR</w:t>
+      </w:r>
+      <w:r>
+        <w:rPr>
+          <w:rFonts w:cs="B Nazanin"/>
+          <w:sz w:val="28"/>
+          <w:szCs w:val="28"/>
+          <w:rtl/>
+          <w:lang w:val="en-US"/>
+        </w:rPr>
+        <w:t xml:space="preserve"> در کنار مدل‌های زبانی عظیم (</w:t>
+      </w:r>
+      <w:r>
+        <w:rPr>
+          <w:rFonts w:cs="B Nazanin"/>
+          <w:sz w:val="28"/>
+          <w:szCs w:val="28"/>
+          <w:lang w:val="en-US" w:bidi="fa-IR"/>
+        </w:rPr>
+        <w:t>LLM</w:t>
+      </w:r>
+      <w:r>
+        <w:rPr>
+          <w:rFonts w:cs="B Nazanin"/>
+          <w:sz w:val="28"/>
+          <w:szCs w:val="28"/>
+          <w:rtl/>
+          <w:lang w:val="en-US"/>
+        </w:rPr>
+        <w:t>)، می‌تواند سامانه‌ای قابل‌اطمینان برای تفسیر و پاسخگویی به متون پیچیده اداری ایجاد کند.</w:t>
+      </w:r>
     </w:p>
     <w:p>
       <w:pPr>
@@ -770,7 +2763,428 @@
 </file>
 
 <file path=word/numbering.xml><?xml version="1.0" encoding="utf-8"?>
-<w:numbering xmlns:wpc="http://schemas.microsoft.com/office/word/2010/wordprocessingCanvas" xmlns:cx="http://schemas.microsoft.com/office/drawing/2014/chartex" xmlns:cx1="http://schemas.microsoft.com/office/drawing/2015/9/8/chartex" xmlns:cx2="http://schemas.microsoft.com/office/drawing/2015/10/21/chartex" xmlns:cx3="http://schemas.microsoft.com/office/drawing/2016/5/9/chartex" xmlns:cx4="http://schemas.microsoft.com/office/drawing/2016/5/10/chartex" xmlns:cx5="http://schemas.microsoft.com/office/drawing/2016/5/11/chartex" xmlns:cx6="http://schemas.microsoft.com/office/drawing/2016/5/12/chartex" xmlns:cx7="http://schemas.microsoft.com/office/drawing/2016/5/13/chartex" xmlns:cx8="http://schemas.microsoft.com/office/drawing/2016/5/14/chartex" xmlns:mc="http://schemas.openxmlformats.org/markup-compatibility/2006" xmlns:aink="http://schemas.microsoft.com/office/drawing/2016/ink" xmlns:am3d="http://schemas.microsoft.com/office/drawing/2017/model3d" xmlns:o="urn:schemas-microsoft-com:office:office" xmlns:oel="http://schemas.microsoft.com/office/2019/extlst" xmlns:r="http://schemas.openxmlformats.org/officeDocument/2006/relationships" xmlns:m="http://schemas.openxmlformats.org/officeDocument/2006/math" xmlns:v="urn:schemas-microsoft-com:vml" xmlns:wp14="http://schemas.microsoft.com/office/word/2010/wordprocessingDrawing" xmlns:wp="http://schemas.openxmlformats.org/drawingml/2006/wordprocessingDrawing" xmlns:w10="urn:schemas-microsoft-com:office:word" xmlns:w="http://schemas.openxmlformats.org/wordprocessingml/2006/main" xmlns:w14="http://schemas.microsoft.com/office/word/2010/wordml" xmlns:w15="http://schemas.microsoft.com/office/word/2012/wordml" xmlns:w16cex="http://schemas.microsoft.com/office/word/2018/wordml/cex" xmlns:w16cid="http://schemas.microsoft.com/office/word/2016/wordml/cid" xmlns:w16="http://schemas.microsoft.com/office/word/2018/wordml" xmlns:w16du="http://schemas.microsoft.com/office/word/2023/wordml/word16du" xmlns:w16sdtdh="http://schemas.microsoft.com/office/word/2020/wordml/sdtdatahash" xmlns:w16sdtfl="http://schemas.microsoft.com/office/word/2024/wordml/sdtformatlock" xmlns:w16se="http://schemas.microsoft.com/office/word/2015/wordml/symex" xmlns:wpg="http://schemas.microsoft.com/office/word/2010/wordprocessingGroup" xmlns:wpi="http://schemas.microsoft.com/office/word/2010/wordprocessingInk" xmlns:wne="http://schemas.microsoft.com/office/word/2006/wordml" xmlns:wps="http://schemas.microsoft.com/office/word/2010/wordprocessingShape" mc:Ignorable="w14 w15 w16se w16cid w16 w16cex w16sdtdh w16sdtfl w16du wp14"/>
+<w:numbering xmlns:wpc="http://schemas.microsoft.com/office/word/2010/wordprocessingCanvas" xmlns:cx="http://schemas.microsoft.com/office/drawing/2014/chartex" xmlns:cx1="http://schemas.microsoft.com/office/drawing/2015/9/8/chartex" xmlns:cx2="http://schemas.microsoft.com/office/drawing/2015/10/21/chartex" xmlns:cx3="http://schemas.microsoft.com/office/drawing/2016/5/9/chartex" xmlns:cx4="http://schemas.microsoft.com/office/drawing/2016/5/10/chartex" xmlns:cx5="http://schemas.microsoft.com/office/drawing/2016/5/11/chartex" xmlns:cx6="http://schemas.microsoft.com/office/drawing/2016/5/12/chartex" xmlns:cx7="http://schemas.microsoft.com/office/drawing/2016/5/13/chartex" xmlns:cx8="http://schemas.microsoft.com/office/drawing/2016/5/14/chartex" xmlns:mc="http://schemas.openxmlformats.org/markup-compatibility/2006" xmlns:aink="http://schemas.microsoft.com/office/drawing/2016/ink" xmlns:am3d="http://schemas.microsoft.com/office/drawing/2017/model3d" xmlns:o="urn:schemas-microsoft-com:office:office" xmlns:oel="http://schemas.microsoft.com/office/2019/extlst" xmlns:r="http://schemas.openxmlformats.org/officeDocument/2006/relationships" xmlns:m="http://schemas.openxmlformats.org/officeDocument/2006/math" xmlns:v="urn:schemas-microsoft-com:vml" xmlns:wp14="http://schemas.microsoft.com/office/word/2010/wordprocessingDrawing" xmlns:wp="http://schemas.openxmlformats.org/drawingml/2006/wordprocessingDrawing" xmlns:w10="urn:schemas-microsoft-com:office:word" xmlns:w="http://schemas.openxmlformats.org/wordprocessingml/2006/main" xmlns:w14="http://schemas.microsoft.com/office/word/2010/wordml" xmlns:w15="http://schemas.microsoft.com/office/word/2012/wordml" xmlns:w16cex="http://schemas.microsoft.com/office/word/2018/wordml/cex" xmlns:w16cid="http://schemas.microsoft.com/office/word/2016/wordml/cid" xmlns:w16="http://schemas.microsoft.com/office/word/2018/wordml" xmlns:w16du="http://schemas.microsoft.com/office/word/2023/wordml/word16du" xmlns:w16sdtdh="http://schemas.microsoft.com/office/word/2020/wordml/sdtdatahash" xmlns:w16sdtfl="http://schemas.microsoft.com/office/word/2024/wordml/sdtformatlock" xmlns:w16se="http://schemas.microsoft.com/office/word/2015/wordml/symex" xmlns:wpg="http://schemas.microsoft.com/office/word/2010/wordprocessingGroup" xmlns:wpi="http://schemas.microsoft.com/office/word/2010/wordprocessingInk" xmlns:wne="http://schemas.microsoft.com/office/word/2006/wordml" xmlns:wps="http://schemas.microsoft.com/office/word/2010/wordprocessingShape" mc:Ignorable="w14 w15 w16se w16cid w16 w16cex w16sdtdh w16sdtfl w16du wp14">
+  <w:abstractNum w:abstractNumId="0" w15:restartNumberingAfterBreak="0">
+    <w:nsid w:val="00DB06D5"/>
+    <w:multiLevelType w:val="multilevel"/>
+    <w:tmpl w:val="B2DC222C"/>
+    <w:lvl w:ilvl="0">
+      <w:start w:val="1"/>
+      <w:numFmt w:val="bullet"/>
+      <w:lvlText w:val=""/>
+      <w:lvlJc w:val="left"/>
+      <w:pPr>
+        <w:tabs>
+          <w:tab w:val="num" w:pos="720"/>
+        </w:tabs>
+        <w:ind w:left="720" w:hanging="360"/>
+      </w:pPr>
+      <w:rPr>
+        <w:rFonts w:ascii="Symbol" w:hAnsi="Symbol" w:hint="default"/>
+        <w:sz w:val="20"/>
+      </w:rPr>
+    </w:lvl>
+    <w:lvl w:ilvl="1" w:tentative="1">
+      <w:start w:val="1"/>
+      <w:numFmt w:val="bullet"/>
+      <w:lvlText w:val="o"/>
+      <w:lvlJc w:val="left"/>
+      <w:pPr>
+        <w:tabs>
+          <w:tab w:val="num" w:pos="1440"/>
+        </w:tabs>
+        <w:ind w:left="1440" w:hanging="360"/>
+      </w:pPr>
+      <w:rPr>
+        <w:rFonts w:ascii="Courier New" w:hAnsi="Courier New" w:hint="default"/>
+        <w:sz w:val="20"/>
+      </w:rPr>
+    </w:lvl>
+    <w:lvl w:ilvl="2" w:tentative="1">
+      <w:start w:val="1"/>
+      <w:numFmt w:val="bullet"/>
+      <w:lvlText w:val=""/>
+      <w:lvlJc w:val="left"/>
+      <w:pPr>
+        <w:tabs>
+          <w:tab w:val="num" w:pos="2160"/>
+        </w:tabs>
+        <w:ind w:left="2160" w:hanging="360"/>
+      </w:pPr>
+      <w:rPr>
+        <w:rFonts w:ascii="Wingdings" w:hAnsi="Wingdings" w:hint="default"/>
+        <w:sz w:val="20"/>
+      </w:rPr>
+    </w:lvl>
+    <w:lvl w:ilvl="3" w:tentative="1">
+      <w:start w:val="1"/>
+      <w:numFmt w:val="bullet"/>
+      <w:lvlText w:val=""/>
+      <w:lvlJc w:val="left"/>
+      <w:pPr>
+        <w:tabs>
+          <w:tab w:val="num" w:pos="2880"/>
+        </w:tabs>
+        <w:ind w:left="2880" w:hanging="360"/>
+      </w:pPr>
+      <w:rPr>
+        <w:rFonts w:ascii="Wingdings" w:hAnsi="Wingdings" w:hint="default"/>
+        <w:sz w:val="20"/>
+      </w:rPr>
+    </w:lvl>
+    <w:lvl w:ilvl="4" w:tentative="1">
+      <w:start w:val="1"/>
+      <w:numFmt w:val="bullet"/>
+      <w:lvlText w:val=""/>
+      <w:lvlJc w:val="left"/>
+      <w:pPr>
+        <w:tabs>
+          <w:tab w:val="num" w:pos="3600"/>
+        </w:tabs>
+        <w:ind w:left="3600" w:hanging="360"/>
+      </w:pPr>
+      <w:rPr>
+        <w:rFonts w:ascii="Wingdings" w:hAnsi="Wingdings" w:hint="default"/>
+        <w:sz w:val="20"/>
+      </w:rPr>
+    </w:lvl>
+    <w:lvl w:ilvl="5" w:tentative="1">
+      <w:start w:val="1"/>
+      <w:numFmt w:val="bullet"/>
+      <w:lvlText w:val=""/>
+      <w:lvlJc w:val="left"/>
+      <w:pPr>
+        <w:tabs>
+          <w:tab w:val="num" w:pos="4320"/>
+        </w:tabs>
+        <w:ind w:left="4320" w:hanging="360"/>
+      </w:pPr>
+      <w:rPr>
+        <w:rFonts w:ascii="Wingdings" w:hAnsi="Wingdings" w:hint="default"/>
+        <w:sz w:val="20"/>
+      </w:rPr>
+    </w:lvl>
+    <w:lvl w:ilvl="6" w:tentative="1">
+      <w:start w:val="1"/>
+      <w:numFmt w:val="bullet"/>
+      <w:lvlText w:val=""/>
+      <w:lvlJc w:val="left"/>
+      <w:pPr>
+        <w:tabs>
+          <w:tab w:val="num" w:pos="5040"/>
+        </w:tabs>
+        <w:ind w:left="5040" w:hanging="360"/>
+      </w:pPr>
+      <w:rPr>
+        <w:rFonts w:ascii="Wingdings" w:hAnsi="Wingdings" w:hint="default"/>
+        <w:sz w:val="20"/>
+      </w:rPr>
+    </w:lvl>
+    <w:lvl w:ilvl="7" w:tentative="1">
+      <w:start w:val="1"/>
+      <w:numFmt w:val="bullet"/>
+      <w:lvlText w:val=""/>
+      <w:lvlJc w:val="left"/>
+      <w:pPr>
+        <w:tabs>
+          <w:tab w:val="num" w:pos="5760"/>
+        </w:tabs>
+        <w:ind w:left="5760" w:hanging="360"/>
+      </w:pPr>
+      <w:rPr>
+        <w:rFonts w:ascii="Wingdings" w:hAnsi="Wingdings" w:hint="default"/>
+        <w:sz w:val="20"/>
+      </w:rPr>
+    </w:lvl>
+    <w:lvl w:ilvl="8" w:tentative="1">
+      <w:start w:val="1"/>
+      <w:numFmt w:val="bullet"/>
+      <w:lvlText w:val=""/>
+      <w:lvlJc w:val="left"/>
+      <w:pPr>
+        <w:tabs>
+          <w:tab w:val="num" w:pos="6480"/>
+        </w:tabs>
+        <w:ind w:left="6480" w:hanging="360"/>
+      </w:pPr>
+      <w:rPr>
+        <w:rFonts w:ascii="Wingdings" w:hAnsi="Wingdings" w:hint="default"/>
+        <w:sz w:val="20"/>
+      </w:rPr>
+    </w:lvl>
+  </w:abstractNum>
+  <w:abstractNum w:abstractNumId="1" w15:restartNumberingAfterBreak="0">
+    <w:nsid w:val="1DEA4961"/>
+    <w:multiLevelType w:val="multilevel"/>
+    <w:tmpl w:val="ABDA4B3E"/>
+    <w:lvl w:ilvl="0">
+      <w:start w:val="1"/>
+      <w:numFmt w:val="decimal"/>
+      <w:lvlText w:val="%1."/>
+      <w:lvlJc w:val="left"/>
+      <w:pPr>
+        <w:tabs>
+          <w:tab w:val="num" w:pos="720"/>
+        </w:tabs>
+        <w:ind w:left="720" w:hanging="360"/>
+      </w:pPr>
+    </w:lvl>
+    <w:lvl w:ilvl="1" w:tentative="1">
+      <w:start w:val="1"/>
+      <w:numFmt w:val="decimal"/>
+      <w:lvlText w:val="%2."/>
+      <w:lvlJc w:val="left"/>
+      <w:pPr>
+        <w:tabs>
+          <w:tab w:val="num" w:pos="1440"/>
+        </w:tabs>
+        <w:ind w:left="1440" w:hanging="360"/>
+      </w:pPr>
+    </w:lvl>
+    <w:lvl w:ilvl="2" w:tentative="1">
+      <w:start w:val="1"/>
+      <w:numFmt w:val="decimal"/>
+      <w:lvlText w:val="%3."/>
+      <w:lvlJc w:val="left"/>
+      <w:pPr>
+        <w:tabs>
+          <w:tab w:val="num" w:pos="2160"/>
+        </w:tabs>
+        <w:ind w:left="2160" w:hanging="360"/>
+      </w:pPr>
+    </w:lvl>
+    <w:lvl w:ilvl="3" w:tentative="1">
+      <w:start w:val="1"/>
+      <w:numFmt w:val="decimal"/>
+      <w:lvlText w:val="%4."/>
+      <w:lvlJc w:val="left"/>
+      <w:pPr>
+        <w:tabs>
+          <w:tab w:val="num" w:pos="2880"/>
+        </w:tabs>
+        <w:ind w:left="2880" w:hanging="360"/>
+      </w:pPr>
+    </w:lvl>
+    <w:lvl w:ilvl="4" w:tentative="1">
+      <w:start w:val="1"/>
+      <w:numFmt w:val="decimal"/>
+      <w:lvlText w:val="%5."/>
+      <w:lvlJc w:val="left"/>
+      <w:pPr>
+        <w:tabs>
+          <w:tab w:val="num" w:pos="3600"/>
+        </w:tabs>
+        <w:ind w:left="3600" w:hanging="360"/>
+      </w:pPr>
+    </w:lvl>
+    <w:lvl w:ilvl="5" w:tentative="1">
+      <w:start w:val="1"/>
+      <w:numFmt w:val="decimal"/>
+      <w:lvlText w:val="%6."/>
+      <w:lvlJc w:val="left"/>
+      <w:pPr>
+        <w:tabs>
+          <w:tab w:val="num" w:pos="4320"/>
+        </w:tabs>
+        <w:ind w:left="4320" w:hanging="360"/>
+      </w:pPr>
+    </w:lvl>
+    <w:lvl w:ilvl="6" w:tentative="1">
+      <w:start w:val="1"/>
+      <w:numFmt w:val="decimal"/>
+      <w:lvlText w:val="%7."/>
+      <w:lvlJc w:val="left"/>
+      <w:pPr>
+        <w:tabs>
+          <w:tab w:val="num" w:pos="5040"/>
+        </w:tabs>
+        <w:ind w:left="5040" w:hanging="360"/>
+      </w:pPr>
+    </w:lvl>
+    <w:lvl w:ilvl="7" w:tentative="1">
+      <w:start w:val="1"/>
+      <w:numFmt w:val="decimal"/>
+      <w:lvlText w:val="%8."/>
+      <w:lvlJc w:val="left"/>
+      <w:pPr>
+        <w:tabs>
+          <w:tab w:val="num" w:pos="5760"/>
+        </w:tabs>
+        <w:ind w:left="5760" w:hanging="360"/>
+      </w:pPr>
+    </w:lvl>
+    <w:lvl w:ilvl="8" w:tentative="1">
+      <w:start w:val="1"/>
+      <w:numFmt w:val="decimal"/>
+      <w:lvlText w:val="%9."/>
+      <w:lvlJc w:val="left"/>
+      <w:pPr>
+        <w:tabs>
+          <w:tab w:val="num" w:pos="6480"/>
+        </w:tabs>
+        <w:ind w:left="6480" w:hanging="360"/>
+      </w:pPr>
+    </w:lvl>
+  </w:abstractNum>
+  <w:abstractNum w:abstractNumId="2" w15:restartNumberingAfterBreak="0">
+    <w:nsid w:val="39536CF9"/>
+    <w:multiLevelType w:val="multilevel"/>
+    <w:tmpl w:val="D0C476C0"/>
+    <w:lvl w:ilvl="0">
+      <w:start w:val="1"/>
+      <w:numFmt w:val="bullet"/>
+      <w:lvlText w:val=""/>
+      <w:lvlJc w:val="left"/>
+      <w:pPr>
+        <w:tabs>
+          <w:tab w:val="num" w:pos="720"/>
+        </w:tabs>
+        <w:ind w:left="720" w:hanging="360"/>
+      </w:pPr>
+      <w:rPr>
+        <w:rFonts w:ascii="Symbol" w:hAnsi="Symbol" w:hint="default"/>
+        <w:sz w:val="20"/>
+      </w:rPr>
+    </w:lvl>
+    <w:lvl w:ilvl="1" w:tentative="1">
+      <w:start w:val="1"/>
+      <w:numFmt w:val="bullet"/>
+      <w:lvlText w:val="o"/>
+      <w:lvlJc w:val="left"/>
+      <w:pPr>
+        <w:tabs>
+          <w:tab w:val="num" w:pos="1440"/>
+        </w:tabs>
+        <w:ind w:left="1440" w:hanging="360"/>
+      </w:pPr>
+      <w:rPr>
+        <w:rFonts w:ascii="Courier New" w:hAnsi="Courier New" w:hint="default"/>
+        <w:sz w:val="20"/>
+      </w:rPr>
+    </w:lvl>
+    <w:lvl w:ilvl="2" w:tentative="1">
+      <w:start w:val="1"/>
+      <w:numFmt w:val="bullet"/>
+      <w:lvlText w:val=""/>
+      <w:lvlJc w:val="left"/>
+      <w:pPr>
+        <w:tabs>
+          <w:tab w:val="num" w:pos="2160"/>
+        </w:tabs>
+        <w:ind w:left="2160" w:hanging="360"/>
+      </w:pPr>
+      <w:rPr>
+        <w:rFonts w:ascii="Wingdings" w:hAnsi="Wingdings" w:hint="default"/>
+        <w:sz w:val="20"/>
+      </w:rPr>
+    </w:lvl>
+    <w:lvl w:ilvl="3" w:tentative="1">
+      <w:start w:val="1"/>
+      <w:numFmt w:val="bullet"/>
+      <w:lvlText w:val=""/>
+      <w:lvlJc w:val="left"/>
+      <w:pPr>
+        <w:tabs>
+          <w:tab w:val="num" w:pos="2880"/>
+        </w:tabs>
+        <w:ind w:left="2880" w:hanging="360"/>
+      </w:pPr>
+      <w:rPr>
+        <w:rFonts w:ascii="Wingdings" w:hAnsi="Wingdings" w:hint="default"/>
+        <w:sz w:val="20"/>
+      </w:rPr>
+    </w:lvl>
+    <w:lvl w:ilvl="4" w:tentative="1">
+      <w:start w:val="1"/>
+      <w:numFmt w:val="bullet"/>
+      <w:lvlText w:val=""/>
+      <w:lvlJc w:val="left"/>
+      <w:pPr>
+        <w:tabs>
+          <w:tab w:val="num" w:pos="3600"/>
+        </w:tabs>
+        <w:ind w:left="3600" w:hanging="360"/>
+      </w:pPr>
+      <w:rPr>
+        <w:rFonts w:ascii="Wingdings" w:hAnsi="Wingdings" w:hint="default"/>
+        <w:sz w:val="20"/>
+      </w:rPr>
+    </w:lvl>
+    <w:lvl w:ilvl="5" w:tentative="1">
+      <w:start w:val="1"/>
+      <w:numFmt w:val="bullet"/>
+      <w:lvlText w:val=""/>
+      <w:lvlJc w:val="left"/>
+      <w:pPr>
+        <w:tabs>
+          <w:tab w:val="num" w:pos="4320"/>
+        </w:tabs>
+        <w:ind w:left="4320" w:hanging="360"/>
+      </w:pPr>
+      <w:rPr>
+        <w:rFonts w:ascii="Wingdings" w:hAnsi="Wingdings" w:hint="default"/>
+        <w:sz w:val="20"/>
+      </w:rPr>
+    </w:lvl>
+    <w:lvl w:ilvl="6" w:tentative="1">
+      <w:start w:val="1"/>
+      <w:numFmt w:val="bullet"/>
+      <w:lvlText w:val=""/>
+      <w:lvlJc w:val="left"/>
+      <w:pPr>
+        <w:tabs>
+          <w:tab w:val="num" w:pos="5040"/>
+        </w:tabs>
+        <w:ind w:left="5040" w:hanging="360"/>
+      </w:pPr>
+      <w:rPr>
+        <w:rFonts w:ascii="Wingdings" w:hAnsi="Wingdings" w:hint="default"/>
+        <w:sz w:val="20"/>
+      </w:rPr>
+    </w:lvl>
+    <w:lvl w:ilvl="7" w:tentative="1">
+      <w:start w:val="1"/>
+      <w:numFmt w:val="bullet"/>
+      <w:lvlText w:val=""/>
+      <w:lvlJc w:val="left"/>
+      <w:pPr>
+        <w:tabs>
+          <w:tab w:val="num" w:pos="5760"/>
+        </w:tabs>
+        <w:ind w:left="5760" w:hanging="360"/>
+      </w:pPr>
+      <w:rPr>
+        <w:rFonts w:ascii="Wingdings" w:hAnsi="Wingdings" w:hint="default"/>
+        <w:sz w:val="20"/>
+      </w:rPr>
+    </w:lvl>
+    <w:lvl w:ilvl="8" w:tentative="1">
+      <w:start w:val="1"/>
+      <w:numFmt w:val="bullet"/>
+      <w:lvlText w:val=""/>
+      <w:lvlJc w:val="left"/>
+      <w:pPr>
+        <w:tabs>
+          <w:tab w:val="num" w:pos="6480"/>
+        </w:tabs>
+        <w:ind w:left="6480" w:hanging="360"/>
+      </w:pPr>
+      <w:rPr>
+        <w:rFonts w:ascii="Wingdings" w:hAnsi="Wingdings" w:hint="default"/>
+        <w:sz w:val="20"/>
+      </w:rPr>
+    </w:lvl>
+  </w:abstractNum>
+  <w:num w:numId="1" w16cid:durableId="1051924706">
+    <w:abstractNumId w:val="0"/>
+  </w:num>
+  <w:num w:numId="2" w16cid:durableId="372464262">
+    <w:abstractNumId w:val="2"/>
+  </w:num>
+  <w:num w:numId="3" w16cid:durableId="1995722905">
+    <w:abstractNumId w:val="1"/>
+  </w:num>
+</w:numbering>
 </file>
 
 <file path=word/styles.xml><?xml version="1.0" encoding="utf-8"?>
@@ -1389,7 +3803,6 @@
   <w:style w:type="character" w:default="1" w:styleId="DefaultParagraphFont">
     <w:name w:val="Default Paragraph Font"/>
     <w:uiPriority w:val="1"/>
-    <w:semiHidden/>
     <w:unhideWhenUsed/>
   </w:style>
   <w:style w:type="table" w:default="1" w:styleId="TableNormal">

</xml_diff>

<commit_message>
docs: Update the some text and add some screenshot
</commit_message>
<xml_diff>
--- a/report.docx
+++ b/report.docx
@@ -1973,7 +1973,7 @@
           <w:rtl/>
           <w:lang w:val="en-US"/>
         </w:rPr>
-        <w:t>رابط کاربری سیستم با تمرکز بر سادگی و کارایی طراحی شده است. کاربر در بالای صفحه یک کادر جستجو مشاهده می‌کند. پس از ثبت پرسش، سیستم در پس‌زمینه شروع به تحلیل ده‌ها صفحه آیین‌نامه کرده و نتیجه را در یک کادر سبز رنگ (</w:t>
+        <w:t>رابط کاربری سیستم با تمرکز بر سادگی و کارایی طراحی شده است. کاربر در بالای صفحه یک کادر جستجو مشاهده می‌کند. پس از ثبت پرسش، سیستم در پس‌زمینه شروع به تحلیل ده‌ها صفحه آیین‌نامه کرده و نتیجه را در یک کادر (</w:t>
       </w:r>
       <w:r>
         <w:rPr>
@@ -2007,31 +2007,565 @@
       </w:pPr>
       <w:r>
         <w:rPr>
-          <w:rFonts w:cs="B Nazanin"/>
-          <w:sz w:val="28"/>
-          <w:szCs w:val="28"/>
-          <w:lang w:val="en-US" w:bidi="fa-IR"/>
-        </w:rPr>
-        <w:t>[</w:t>
-      </w:r>
-      <w:r>
-        <w:rPr>
-          <w:rFonts w:cs="B Nazanin"/>
-          <w:sz w:val="28"/>
-          <w:szCs w:val="28"/>
-          <w:rtl/>
-          <w:lang w:val="en-US"/>
-        </w:rPr>
-        <w:t>در این قسمت، یک اسکرین‌شات از محیط تیره برنامه که در آن هوش مصنوعی به یک پرسش پاسخ داده و منابع آن در پایین راست‌چین شده‌اند، قرار دهید</w:t>
-      </w:r>
-      <w:r>
-        <w:rPr>
-          <w:rFonts w:cs="B Nazanin"/>
-          <w:sz w:val="28"/>
-          <w:szCs w:val="28"/>
-          <w:lang w:val="en-US" w:bidi="fa-IR"/>
-        </w:rPr>
-        <w:t>]</w:t>
+          <w:noProof/>
+          <w14:ligatures w14:val="standardContextual"/>
+        </w:rPr>
+        <w:drawing>
+          <wp:inline distT="0" distB="0" distL="0" distR="0" wp14:anchorId="329A224C" wp14:editId="318D0239">
+            <wp:extent cx="5943600" cy="2586355"/>
+            <wp:effectExtent l="0" t="0" r="0" b="4445"/>
+            <wp:docPr id="1026367558" name="Picture 1"/>
+            <wp:cNvGraphicFramePr>
+              <a:graphicFrameLocks xmlns:a="http://schemas.openxmlformats.org/drawingml/2006/main" noChangeAspect="1"/>
+            </wp:cNvGraphicFramePr>
+            <a:graphic xmlns:a="http://schemas.openxmlformats.org/drawingml/2006/main">
+              <a:graphicData uri="http://schemas.openxmlformats.org/drawingml/2006/picture">
+                <pic:pic xmlns:pic="http://schemas.openxmlformats.org/drawingml/2006/picture">
+                  <pic:nvPicPr>
+                    <pic:cNvPr id="1026367558" name=""/>
+                    <pic:cNvPicPr/>
+                  </pic:nvPicPr>
+                  <pic:blipFill>
+                    <a:blip r:embed="rId8"/>
+                    <a:stretch>
+                      <a:fillRect/>
+                    </a:stretch>
+                  </pic:blipFill>
+                  <pic:spPr>
+                    <a:xfrm>
+                      <a:off x="0" y="0"/>
+                      <a:ext cx="5943600" cy="2586355"/>
+                    </a:xfrm>
+                    <a:prstGeom prst="rect">
+                      <a:avLst/>
+                    </a:prstGeom>
+                  </pic:spPr>
+                </pic:pic>
+              </a:graphicData>
+            </a:graphic>
+          </wp:inline>
+        </w:drawing>
+      </w:r>
+    </w:p>
+    <w:p>
+      <w:pPr>
+        <w:rPr>
+          <w:rFonts w:cs="B Nazanin"/>
+          <w:sz w:val="28"/>
+          <w:szCs w:val="28"/>
+          <w:lang w:val="en-US"/>
+        </w:rPr>
+      </w:pPr>
+      <w:r>
+        <w:rPr>
+          <w:rFonts w:cs="B Nazanin"/>
+          <w:sz w:val="28"/>
+          <w:szCs w:val="28"/>
+          <w:rtl/>
+          <w:lang w:val="en-US"/>
+        </w:rPr>
+        <w:lastRenderedPageBreak/>
+        <w:t>۳. نمایش محیط برنامه و سناریوهای کاربری</w:t>
+      </w:r>
+    </w:p>
+    <w:p>
+      <w:pPr>
+        <w:rPr>
+          <w:rFonts w:cs="B Nazanin"/>
+          <w:sz w:val="28"/>
+          <w:szCs w:val="28"/>
+          <w:rtl/>
+          <w:lang w:val="en-US"/>
+        </w:rPr>
+      </w:pPr>
+      <w:r>
+        <w:rPr>
+          <w:rFonts w:cs="B Nazanin"/>
+          <w:sz w:val="28"/>
+          <w:szCs w:val="28"/>
+          <w:rtl/>
+          <w:lang w:val="en-US"/>
+        </w:rPr>
+        <w:t>رابط کاربری این سامانه با تمرکز بر سادگی، کارایی و تجربه کاربری (</w:t>
+      </w:r>
+      <w:r>
+        <w:rPr>
+          <w:rFonts w:cs="B Nazanin"/>
+          <w:sz w:val="28"/>
+          <w:szCs w:val="28"/>
+          <w:lang w:val="en-US"/>
+        </w:rPr>
+        <w:t>UX</w:t>
+      </w:r>
+      <w:r>
+        <w:rPr>
+          <w:rFonts w:cs="B Nazanin"/>
+          <w:sz w:val="28"/>
+          <w:szCs w:val="28"/>
+          <w:rtl/>
+          <w:lang w:val="en-US"/>
+        </w:rPr>
+        <w:t>) بهینه طراحی شده است. استفاده از تم تیره (</w:t>
+      </w:r>
+      <w:r>
+        <w:rPr>
+          <w:rFonts w:cs="B Nazanin"/>
+          <w:sz w:val="28"/>
+          <w:szCs w:val="28"/>
+          <w:lang w:val="en-US"/>
+        </w:rPr>
+        <w:t>Dark Mode</w:t>
+      </w:r>
+      <w:r>
+        <w:rPr>
+          <w:rFonts w:cs="B Nazanin"/>
+          <w:sz w:val="28"/>
+          <w:szCs w:val="28"/>
+          <w:rtl/>
+          <w:lang w:val="en-US"/>
+        </w:rPr>
+        <w:t>)، کادرهای تفکیک‌شده و قالب‌بندی کاملاً راست‌چین (</w:t>
+      </w:r>
+      <w:r>
+        <w:rPr>
+          <w:rFonts w:cs="B Nazanin"/>
+          <w:sz w:val="28"/>
+          <w:szCs w:val="28"/>
+          <w:lang w:val="en-US"/>
+        </w:rPr>
+        <w:t>RTL</w:t>
+      </w:r>
+      <w:r>
+        <w:rPr>
+          <w:rFonts w:cs="B Nazanin"/>
+          <w:sz w:val="28"/>
+          <w:szCs w:val="28"/>
+          <w:rtl/>
+          <w:lang w:val="en-US"/>
+        </w:rPr>
+        <w:t>)، فضایی مدرن و خوانا را برای کاربر فارسی‌زبان فراهم کرده است. در ادامه، عملکرد سامانه در قالب سناریوهای مختلف اجرایی بررسی شده است:</w:t>
+      </w:r>
+    </w:p>
+    <w:p>
+      <w:pPr>
+        <w:rPr>
+          <w:rFonts w:cs="B Nazanin"/>
+          <w:sz w:val="28"/>
+          <w:szCs w:val="28"/>
+          <w:rtl/>
+          <w:lang w:val="en-US"/>
+        </w:rPr>
+      </w:pPr>
+      <w:r>
+        <w:rPr>
+          <w:rFonts w:cs="B Nazanin"/>
+          <w:sz w:val="28"/>
+          <w:szCs w:val="28"/>
+          <w:rtl/>
+          <w:lang w:val="en-US"/>
+        </w:rPr>
+        <w:t>۳-۱. نمای اولیه و صفحه ورود پرسش</w:t>
+      </w:r>
+    </w:p>
+    <w:p>
+      <w:pPr>
+        <w:rPr>
+          <w:rFonts w:cs="B Nazanin"/>
+          <w:sz w:val="28"/>
+          <w:szCs w:val="28"/>
+          <w:rtl/>
+          <w:lang w:val="en-US"/>
+        </w:rPr>
+      </w:pPr>
+      <w:r>
+        <w:rPr>
+          <w:rFonts w:cs="B Nazanin"/>
+          <w:sz w:val="28"/>
+          <w:szCs w:val="28"/>
+          <w:rtl/>
+          <w:lang w:val="en-US"/>
+        </w:rPr>
+        <w:t>هنگامی که کاربر سامانه را اجرا می‌کند، با یک محیط یکپارچه مواجه می‌شود که شامل عنوان برنامه و یک کادر متنی ساده برای دریافت پرسش است. کاربر می‌تواند سؤال خود را به زبان محاوره یا رسمی در این کادر تایپ کرده و روی دکمه «جستجو» کلیک کند. بلافاصله پس از کلیک، یک نشانگر در حال چرخش (</w:t>
+      </w:r>
+      <w:r>
+        <w:rPr>
+          <w:rFonts w:cs="B Nazanin"/>
+          <w:sz w:val="28"/>
+          <w:szCs w:val="28"/>
+          <w:lang w:val="en-US"/>
+        </w:rPr>
+        <w:t>Spinner</w:t>
+      </w:r>
+      <w:r>
+        <w:rPr>
+          <w:rFonts w:cs="B Nazanin"/>
+          <w:sz w:val="28"/>
+          <w:szCs w:val="28"/>
+          <w:rtl/>
+          <w:lang w:val="en-US"/>
+        </w:rPr>
+        <w:t xml:space="preserve">) با پیام "لطفا صبر کنید... سیستم در حال تحلیل مستندات است..." ظاهر می‌شود که نشان‌دهنده آغاز فرآیند جستجوی برداری و ارتباط با </w:t>
+      </w:r>
+      <w:r>
+        <w:rPr>
+          <w:rFonts w:cs="B Nazanin"/>
+          <w:sz w:val="28"/>
+          <w:szCs w:val="28"/>
+          <w:lang w:val="en-US"/>
+        </w:rPr>
+        <w:t>API</w:t>
+      </w:r>
+      <w:r>
+        <w:rPr>
+          <w:rFonts w:cs="B Nazanin"/>
+          <w:sz w:val="28"/>
+          <w:szCs w:val="28"/>
+          <w:rtl/>
+          <w:lang w:val="en-US"/>
+        </w:rPr>
+        <w:t xml:space="preserve"> مدل زبانی است.</w:t>
+      </w:r>
+      <w:r>
+        <w:rPr>
+          <w:rFonts w:cs="B Nazanin"/>
+          <w:sz w:val="28"/>
+          <w:szCs w:val="28"/>
+          <w:rtl/>
+          <w:lang w:val="en-US"/>
+        </w:rPr>
+        <w:br/>
+      </w:r>
+      <w:r>
+        <w:rPr>
+          <w:noProof/>
+          <w14:ligatures w14:val="standardContextual"/>
+        </w:rPr>
+        <w:drawing>
+          <wp:inline distT="0" distB="0" distL="0" distR="0" wp14:anchorId="23B5B934" wp14:editId="0D8EC20E">
+            <wp:extent cx="3152381" cy="1266667"/>
+            <wp:effectExtent l="0" t="0" r="0" b="0"/>
+            <wp:docPr id="1144483609" name="Picture 1"/>
+            <wp:cNvGraphicFramePr>
+              <a:graphicFrameLocks xmlns:a="http://schemas.openxmlformats.org/drawingml/2006/main" noChangeAspect="1"/>
+            </wp:cNvGraphicFramePr>
+            <a:graphic xmlns:a="http://schemas.openxmlformats.org/drawingml/2006/main">
+              <a:graphicData uri="http://schemas.openxmlformats.org/drawingml/2006/picture">
+                <pic:pic xmlns:pic="http://schemas.openxmlformats.org/drawingml/2006/picture">
+                  <pic:nvPicPr>
+                    <pic:cNvPr id="1144483609" name=""/>
+                    <pic:cNvPicPr/>
+                  </pic:nvPicPr>
+                  <pic:blipFill>
+                    <a:blip r:embed="rId9"/>
+                    <a:stretch>
+                      <a:fillRect/>
+                    </a:stretch>
+                  </pic:blipFill>
+                  <pic:spPr>
+                    <a:xfrm>
+                      <a:off x="0" y="0"/>
+                      <a:ext cx="3152381" cy="1266667"/>
+                    </a:xfrm>
+                    <a:prstGeom prst="rect">
+                      <a:avLst/>
+                    </a:prstGeom>
+                  </pic:spPr>
+                </pic:pic>
+              </a:graphicData>
+            </a:graphic>
+          </wp:inline>
+        </w:drawing>
+      </w:r>
+    </w:p>
+    <w:p>
+      <w:pPr>
+        <w:rPr>
+          <w:rFonts w:cs="B Nazanin"/>
+          <w:sz w:val="28"/>
+          <w:szCs w:val="28"/>
+          <w:rtl/>
+          <w:lang w:val="en-US"/>
+        </w:rPr>
+      </w:pPr>
+      <w:r>
+        <w:rPr>
+          <w:rFonts w:cs="B Nazanin"/>
+          <w:sz w:val="28"/>
+          <w:szCs w:val="28"/>
+          <w:rtl/>
+          <w:lang w:val="en-US"/>
+        </w:rPr>
+        <w:t>۳-۲. سناریوی اول: پاسخگویی موفق و استخراج قوانین</w:t>
+      </w:r>
+    </w:p>
+    <w:p>
+      <w:pPr>
+        <w:rPr>
+          <w:rFonts w:cs="B Nazanin"/>
+          <w:sz w:val="28"/>
+          <w:szCs w:val="28"/>
+          <w:rtl/>
+          <w:lang w:val="en-US"/>
+        </w:rPr>
+      </w:pPr>
+      <w:r>
+        <w:rPr>
+          <w:rFonts w:cs="B Nazanin"/>
+          <w:sz w:val="28"/>
+          <w:szCs w:val="28"/>
+          <w:rtl/>
+          <w:lang w:val="en-US"/>
+        </w:rPr>
+        <w:t>اگر کاربر سؤالی مرتبط با آیین‌نامه‌ها بپرسد (به عنوان مثال: "</w:t>
+      </w:r>
+      <w:r>
+        <w:rPr>
+          <w:rFonts w:cs="B Nazanin"/>
+          <w:sz w:val="28"/>
+          <w:szCs w:val="28"/>
+          <w:rtl/>
+          <w:lang w:val="en-US"/>
+        </w:rPr>
+        <w:t>شرایط حذف و اضافه چیست؟</w:t>
+      </w:r>
+      <w:r>
+        <w:rPr>
+          <w:rFonts w:cs="B Nazanin"/>
+          <w:sz w:val="28"/>
+          <w:szCs w:val="28"/>
+          <w:rtl/>
+          <w:lang w:val="en-US"/>
+        </w:rPr>
+        <w:t>" را وارد کند)، سیستم پس از تحلیل، پاسخی جامع و دسته‌بندی شده را در یک کادر سبز رنگ (</w:t>
+      </w:r>
+      <w:r>
+        <w:rPr>
+          <w:rFonts w:cs="B Nazanin"/>
+          <w:sz w:val="28"/>
+          <w:szCs w:val="28"/>
+          <w:lang w:val="en-US"/>
+        </w:rPr>
+        <w:t>Success Box</w:t>
+      </w:r>
+      <w:r>
+        <w:rPr>
+          <w:rFonts w:cs="B Nazanin"/>
+          <w:sz w:val="28"/>
+          <w:szCs w:val="28"/>
+          <w:rtl/>
+          <w:lang w:val="en-US"/>
+        </w:rPr>
+        <w:t>) نمایش می‌دهد.</w:t>
+      </w:r>
+      <w:r>
+        <w:rPr>
+          <w:rFonts w:cs="B Nazanin"/>
+          <w:sz w:val="28"/>
+          <w:szCs w:val="28"/>
+          <w:rtl/>
+          <w:lang w:val="en-US"/>
+        </w:rPr>
+        <w:br/>
+        <w:t xml:space="preserve">یکی از مهم‌ترین ویژگی‌های این بخش، کادر «مستندات و منابع ارجاعی» در انتهای پاسخ است. در این قسمت، سیستم دقیقاً اعلام می‌کند که این پاسخ را از کدام فایل‌های </w:t>
+      </w:r>
+      <w:r>
+        <w:rPr>
+          <w:rFonts w:cs="B Nazanin"/>
+          <w:sz w:val="28"/>
+          <w:szCs w:val="28"/>
+          <w:lang w:val="en-US"/>
+        </w:rPr>
+        <w:t>PDF</w:t>
+      </w:r>
+      <w:r>
+        <w:rPr>
+          <w:rFonts w:cs="B Nazanin"/>
+          <w:sz w:val="28"/>
+          <w:szCs w:val="28"/>
+          <w:rtl/>
+          <w:lang w:val="en-US"/>
+        </w:rPr>
+        <w:t xml:space="preserve"> و دقیقاً از چه صفحاتی استخراج کرده است تا کاربر بتواند برای اطمینان، به اصل آیین‌نامه مراجعه کند.</w:t>
+      </w:r>
+    </w:p>
+    <w:p>
+      <w:pPr>
+        <w:rPr>
+          <w:rFonts w:cs="B Nazanin"/>
+          <w:sz w:val="28"/>
+          <w:szCs w:val="28"/>
+          <w:rtl/>
+          <w:lang w:val="en-US"/>
+        </w:rPr>
+      </w:pPr>
+      <w:r>
+        <w:rPr>
+          <w:noProof/>
+          <w14:ligatures w14:val="standardContextual"/>
+        </w:rPr>
+        <w:lastRenderedPageBreak/>
+        <w:drawing>
+          <wp:inline distT="0" distB="0" distL="0" distR="0" wp14:anchorId="6B16C6A5" wp14:editId="39E9BC26">
+            <wp:extent cx="5943600" cy="1957070"/>
+            <wp:effectExtent l="0" t="0" r="0" b="5080"/>
+            <wp:docPr id="1210725783" name="Picture 1"/>
+            <wp:cNvGraphicFramePr>
+              <a:graphicFrameLocks xmlns:a="http://schemas.openxmlformats.org/drawingml/2006/main" noChangeAspect="1"/>
+            </wp:cNvGraphicFramePr>
+            <a:graphic xmlns:a="http://schemas.openxmlformats.org/drawingml/2006/main">
+              <a:graphicData uri="http://schemas.openxmlformats.org/drawingml/2006/picture">
+                <pic:pic xmlns:pic="http://schemas.openxmlformats.org/drawingml/2006/picture">
+                  <pic:nvPicPr>
+                    <pic:cNvPr id="1210725783" name=""/>
+                    <pic:cNvPicPr/>
+                  </pic:nvPicPr>
+                  <pic:blipFill>
+                    <a:blip r:embed="rId10"/>
+                    <a:stretch>
+                      <a:fillRect/>
+                    </a:stretch>
+                  </pic:blipFill>
+                  <pic:spPr>
+                    <a:xfrm>
+                      <a:off x="0" y="0"/>
+                      <a:ext cx="5943600" cy="1957070"/>
+                    </a:xfrm>
+                    <a:prstGeom prst="rect">
+                      <a:avLst/>
+                    </a:prstGeom>
+                  </pic:spPr>
+                </pic:pic>
+              </a:graphicData>
+            </a:graphic>
+          </wp:inline>
+        </w:drawing>
+      </w:r>
+    </w:p>
+    <w:p>
+      <w:pPr>
+        <w:rPr>
+          <w:rFonts w:cs="B Nazanin"/>
+          <w:sz w:val="28"/>
+          <w:szCs w:val="28"/>
+          <w:rtl/>
+          <w:lang w:val="en-US"/>
+        </w:rPr>
+      </w:pPr>
+      <w:r>
+        <w:rPr>
+          <w:noProof/>
+          <w14:ligatures w14:val="standardContextual"/>
+        </w:rPr>
+        <w:drawing>
+          <wp:inline distT="0" distB="0" distL="0" distR="0" wp14:anchorId="265ABE17" wp14:editId="0F7CA690">
+            <wp:extent cx="5943600" cy="1866900"/>
+            <wp:effectExtent l="0" t="0" r="0" b="0"/>
+            <wp:docPr id="1732380602" name="Picture 1"/>
+            <wp:cNvGraphicFramePr>
+              <a:graphicFrameLocks xmlns:a="http://schemas.openxmlformats.org/drawingml/2006/main" noChangeAspect="1"/>
+            </wp:cNvGraphicFramePr>
+            <a:graphic xmlns:a="http://schemas.openxmlformats.org/drawingml/2006/main">
+              <a:graphicData uri="http://schemas.openxmlformats.org/drawingml/2006/picture">
+                <pic:pic xmlns:pic="http://schemas.openxmlformats.org/drawingml/2006/picture">
+                  <pic:nvPicPr>
+                    <pic:cNvPr id="1732380602" name=""/>
+                    <pic:cNvPicPr/>
+                  </pic:nvPicPr>
+                  <pic:blipFill>
+                    <a:blip r:embed="rId11"/>
+                    <a:stretch>
+                      <a:fillRect/>
+                    </a:stretch>
+                  </pic:blipFill>
+                  <pic:spPr>
+                    <a:xfrm>
+                      <a:off x="0" y="0"/>
+                      <a:ext cx="5943600" cy="1866900"/>
+                    </a:xfrm>
+                    <a:prstGeom prst="rect">
+                      <a:avLst/>
+                    </a:prstGeom>
+                  </pic:spPr>
+                </pic:pic>
+              </a:graphicData>
+            </a:graphic>
+          </wp:inline>
+        </w:drawing>
+      </w:r>
+    </w:p>
+    <w:p>
+      <w:pPr>
+        <w:rPr>
+          <w:rFonts w:cs="B Nazanin"/>
+          <w:sz w:val="28"/>
+          <w:szCs w:val="28"/>
+          <w:rtl/>
+          <w:lang w:val="en-US"/>
+        </w:rPr>
+      </w:pPr>
+      <w:r>
+        <w:rPr>
+          <w:noProof/>
+          <w14:ligatures w14:val="standardContextual"/>
+        </w:rPr>
+        <w:lastRenderedPageBreak/>
+        <w:drawing>
+          <wp:inline distT="0" distB="0" distL="0" distR="0" wp14:anchorId="1CA33B10" wp14:editId="3D1D9062">
+            <wp:extent cx="3824605" cy="8229600"/>
+            <wp:effectExtent l="0" t="0" r="4445" b="0"/>
+            <wp:docPr id="1658287990" name="Picture 1"/>
+            <wp:cNvGraphicFramePr>
+              <a:graphicFrameLocks xmlns:a="http://schemas.openxmlformats.org/drawingml/2006/main" noChangeAspect="1"/>
+            </wp:cNvGraphicFramePr>
+            <a:graphic xmlns:a="http://schemas.openxmlformats.org/drawingml/2006/main">
+              <a:graphicData uri="http://schemas.openxmlformats.org/drawingml/2006/picture">
+                <pic:pic xmlns:pic="http://schemas.openxmlformats.org/drawingml/2006/picture">
+                  <pic:nvPicPr>
+                    <pic:cNvPr id="1658287990" name=""/>
+                    <pic:cNvPicPr/>
+                  </pic:nvPicPr>
+                  <pic:blipFill>
+                    <a:blip r:embed="rId12"/>
+                    <a:stretch>
+                      <a:fillRect/>
+                    </a:stretch>
+                  </pic:blipFill>
+                  <pic:spPr>
+                    <a:xfrm>
+                      <a:off x="0" y="0"/>
+                      <a:ext cx="3824605" cy="8229600"/>
+                    </a:xfrm>
+                    <a:prstGeom prst="rect">
+                      <a:avLst/>
+                    </a:prstGeom>
+                  </pic:spPr>
+                </pic:pic>
+              </a:graphicData>
+            </a:graphic>
+          </wp:inline>
+        </w:drawing>
+      </w:r>
+    </w:p>
+    <w:p>
+      <w:pPr>
+        <w:rPr>
+          <w:rFonts w:cs="B Nazanin"/>
+          <w:sz w:val="28"/>
+          <w:szCs w:val="28"/>
+          <w:rtl/>
+          <w:lang w:val="en-US"/>
+        </w:rPr>
+      </w:pPr>
+      <w:r>
+        <w:rPr>
+          <w:rFonts w:cs="B Nazanin"/>
+          <w:sz w:val="28"/>
+          <w:szCs w:val="28"/>
+          <w:rtl/>
+          <w:lang w:val="en-US"/>
+        </w:rPr>
+        <w:lastRenderedPageBreak/>
+        <w:t>۳-۳. سناریوی دوم: مدیریت پرسش‌های نامرتبط یا خارج از مستندات</w:t>
       </w:r>
     </w:p>
     <w:p>
@@ -2042,10 +2576,131 @@
           <w:bCs/>
           <w:sz w:val="32"/>
           <w:szCs w:val="32"/>
-          <w:lang w:val="en-US" w:bidi="fa-IR"/>
-        </w:rPr>
-      </w:pPr>
-      <w:r>
+          <w:rtl/>
+          <w:lang w:val="en-US" w:bidi="fa-IR"/>
+        </w:rPr>
+      </w:pPr>
+      <w:r>
+        <w:rPr>
+          <w:rFonts w:cs="B Nazanin"/>
+          <w:sz w:val="28"/>
+          <w:szCs w:val="28"/>
+          <w:rtl/>
+          <w:lang w:val="en-US"/>
+        </w:rPr>
+        <w:t xml:space="preserve">یکی از الزامات اصلی معماری </w:t>
+      </w:r>
+      <w:r>
+        <w:rPr>
+          <w:rFonts w:cs="B Nazanin"/>
+          <w:sz w:val="28"/>
+          <w:szCs w:val="28"/>
+          <w:lang w:val="en-US"/>
+        </w:rPr>
+        <w:t>RAG</w:t>
+      </w:r>
+      <w:r>
+        <w:rPr>
+          <w:rFonts w:cs="B Nazanin"/>
+          <w:sz w:val="28"/>
+          <w:szCs w:val="28"/>
+          <w:rtl/>
+          <w:lang w:val="en-US"/>
+        </w:rPr>
+        <w:t>، جلوگیری از دروغ‌پردازی هوش مصنوعی (</w:t>
+      </w:r>
+      <w:r>
+        <w:rPr>
+          <w:rFonts w:cs="B Nazanin"/>
+          <w:sz w:val="28"/>
+          <w:szCs w:val="28"/>
+          <w:lang w:val="en-US"/>
+        </w:rPr>
+        <w:t>Hallucination</w:t>
+      </w:r>
+      <w:r>
+        <w:rPr>
+          <w:rFonts w:cs="B Nazanin"/>
+          <w:sz w:val="28"/>
+          <w:szCs w:val="28"/>
+          <w:rtl/>
+          <w:lang w:val="en-US"/>
+        </w:rPr>
+        <w:t xml:space="preserve">) است. اگر کاربر سؤالی بپرسد که جواب آن در هیچ‌کدام از فایل‌های </w:t>
+      </w:r>
+      <w:r>
+        <w:rPr>
+          <w:rFonts w:cs="B Nazanin"/>
+          <w:sz w:val="28"/>
+          <w:szCs w:val="28"/>
+          <w:lang w:val="en-US"/>
+        </w:rPr>
+        <w:t>PDF</w:t>
+      </w:r>
+      <w:r>
+        <w:rPr>
+          <w:rFonts w:cs="B Nazanin"/>
+          <w:sz w:val="28"/>
+          <w:szCs w:val="28"/>
+          <w:rtl/>
+          <w:lang w:val="en-US"/>
+        </w:rPr>
+        <w:t xml:space="preserve"> آپلود شده وجود نداشته باشد (مثلاً سؤالی درباره اخبار روز یا قوانین یک دانشگاه دیگر)، الگوریتم سیستم به جای حدس زدن یا ارائه اطلاعات غلط، فرآیند را متوقف کرده و پیام هشداری با مضمون "پاسخ این سؤال در اسناد موجود یافت نشد." را به کاربر نمایش می‌دهد. این ویژگی اعتبار و اتکاپذیری سامانه را در محیط‌های رسمی دانشگاهی تضمین می‌کند.</w:t>
+      </w:r>
+      <w:r>
+        <w:rPr>
+          <w:rFonts w:cs="B Nazanin"/>
+          <w:sz w:val="28"/>
+          <w:szCs w:val="28"/>
+          <w:rtl/>
+          <w:lang w:val="en-US"/>
+        </w:rPr>
+        <w:br/>
+      </w:r>
+      <w:r>
+        <w:rPr>
+          <w:noProof/>
+          <w14:ligatures w14:val="standardContextual"/>
+        </w:rPr>
+        <w:drawing>
+          <wp:inline distT="0" distB="0" distL="0" distR="0" wp14:anchorId="1D744651" wp14:editId="10BA5BD5">
+            <wp:extent cx="5943600" cy="3441065"/>
+            <wp:effectExtent l="0" t="0" r="0" b="6985"/>
+            <wp:docPr id="1300587859" name="Picture 1"/>
+            <wp:cNvGraphicFramePr>
+              <a:graphicFrameLocks xmlns:a="http://schemas.openxmlformats.org/drawingml/2006/main" noChangeAspect="1"/>
+            </wp:cNvGraphicFramePr>
+            <a:graphic xmlns:a="http://schemas.openxmlformats.org/drawingml/2006/main">
+              <a:graphicData uri="http://schemas.openxmlformats.org/drawingml/2006/picture">
+                <pic:pic xmlns:pic="http://schemas.openxmlformats.org/drawingml/2006/picture">
+                  <pic:nvPicPr>
+                    <pic:cNvPr id="1300587859" name=""/>
+                    <pic:cNvPicPr/>
+                  </pic:nvPicPr>
+                  <pic:blipFill>
+                    <a:blip r:embed="rId13"/>
+                    <a:stretch>
+                      <a:fillRect/>
+                    </a:stretch>
+                  </pic:blipFill>
+                  <pic:spPr>
+                    <a:xfrm>
+                      <a:off x="0" y="0"/>
+                      <a:ext cx="5943600" cy="3441065"/>
+                    </a:xfrm>
+                    <a:prstGeom prst="rect">
+                      <a:avLst/>
+                    </a:prstGeom>
+                  </pic:spPr>
+                </pic:pic>
+              </a:graphicData>
+            </a:graphic>
+          </wp:inline>
+        </w:drawing>
+      </w:r>
+    </w:p>
+    <w:p>
+      <w:pPr>
         <w:rPr>
           <w:rFonts w:cs="B Nazanin"/>
           <w:b/>
@@ -2055,6 +2710,121 @@
           <w:rtl/>
           <w:lang w:val="en-US" w:bidi="fa-IR"/>
         </w:rPr>
+      </w:pPr>
+    </w:p>
+    <w:p>
+      <w:pPr>
+        <w:rPr>
+          <w:rFonts w:cs="B Nazanin"/>
+          <w:b/>
+          <w:bCs/>
+          <w:sz w:val="32"/>
+          <w:szCs w:val="32"/>
+          <w:rtl/>
+          <w:lang w:val="en-US" w:bidi="fa-IR"/>
+        </w:rPr>
+      </w:pPr>
+    </w:p>
+    <w:p>
+      <w:pPr>
+        <w:rPr>
+          <w:rFonts w:cs="B Nazanin"/>
+          <w:b/>
+          <w:bCs/>
+          <w:sz w:val="32"/>
+          <w:szCs w:val="32"/>
+          <w:rtl/>
+          <w:lang w:val="en-US" w:bidi="fa-IR"/>
+        </w:rPr>
+      </w:pPr>
+    </w:p>
+    <w:p>
+      <w:pPr>
+        <w:rPr>
+          <w:rFonts w:cs="B Nazanin"/>
+          <w:b/>
+          <w:bCs/>
+          <w:sz w:val="32"/>
+          <w:szCs w:val="32"/>
+          <w:rtl/>
+          <w:lang w:val="en-US" w:bidi="fa-IR"/>
+        </w:rPr>
+      </w:pPr>
+    </w:p>
+    <w:p>
+      <w:pPr>
+        <w:rPr>
+          <w:rFonts w:cs="B Nazanin"/>
+          <w:b/>
+          <w:bCs/>
+          <w:sz w:val="32"/>
+          <w:szCs w:val="32"/>
+          <w:rtl/>
+          <w:lang w:val="en-US" w:bidi="fa-IR"/>
+        </w:rPr>
+      </w:pPr>
+    </w:p>
+    <w:p>
+      <w:pPr>
+        <w:rPr>
+          <w:rFonts w:cs="B Nazanin"/>
+          <w:b/>
+          <w:bCs/>
+          <w:sz w:val="32"/>
+          <w:szCs w:val="32"/>
+          <w:rtl/>
+          <w:lang w:val="en-US" w:bidi="fa-IR"/>
+        </w:rPr>
+      </w:pPr>
+    </w:p>
+    <w:p>
+      <w:pPr>
+        <w:rPr>
+          <w:rFonts w:cs="B Nazanin"/>
+          <w:b/>
+          <w:bCs/>
+          <w:sz w:val="32"/>
+          <w:szCs w:val="32"/>
+          <w:rtl/>
+          <w:lang w:val="en-US" w:bidi="fa-IR"/>
+        </w:rPr>
+      </w:pPr>
+    </w:p>
+    <w:p>
+      <w:pPr>
+        <w:rPr>
+          <w:rFonts w:cs="B Nazanin"/>
+          <w:b/>
+          <w:bCs/>
+          <w:sz w:val="32"/>
+          <w:szCs w:val="32"/>
+          <w:rtl/>
+          <w:lang w:val="en-US" w:bidi="fa-IR"/>
+        </w:rPr>
+      </w:pPr>
+    </w:p>
+    <w:p>
+      <w:pPr>
+        <w:rPr>
+          <w:rFonts w:cs="B Nazanin"/>
+          <w:b/>
+          <w:bCs/>
+          <w:sz w:val="32"/>
+          <w:szCs w:val="32"/>
+          <w:lang w:val="en-US" w:bidi="fa-IR"/>
+        </w:rPr>
+      </w:pPr>
+      <w:r>
+        <w:rPr>
+          <w:rFonts w:cs="B Nazanin"/>
+          <w:b/>
+          <w:bCs/>
+          <w:sz w:val="32"/>
+          <w:szCs w:val="32"/>
+          <w:rtl/>
+          <w:lang w:val="en-US" w:bidi="fa-IR"/>
+        </w:rPr>
+        <w:lastRenderedPageBreak/>
         <w:t xml:space="preserve">۴. </w:t>
       </w:r>
       <w:r>
@@ -2271,6 +3041,15 @@
         </w:rPr>
         <w:t>.</w:t>
       </w:r>
+      <w:r>
+        <w:rPr>
+          <w:rFonts w:cs="B Nazanin"/>
+          <w:sz w:val="28"/>
+          <w:szCs w:val="28"/>
+          <w:lang w:val="en-US"/>
+        </w:rPr>
+        <w:t xml:space="preserve"> </w:t>
+      </w:r>
     </w:p>
     <w:p>
       <w:pPr>
@@ -2413,7 +3192,6 @@
           <w:rtl/>
           <w:lang w:val="en-US"/>
         </w:rPr>
-        <w:lastRenderedPageBreak/>
         <w:t>ساخت پایگاه دانش:</w:t>
       </w:r>
       <w:r>
@@ -2543,7 +3321,7 @@
           <w:szCs w:val="28"/>
           <w:lang w:val="en-US" w:bidi="fa-IR"/>
         </w:rPr>
-        <w:t xml:space="preserve"> run web_interface-2.py</w:t>
+        <w:t xml:space="preserve"> run web_interface.py</w:t>
       </w:r>
       <w:r>
         <w:rPr>
@@ -2619,7 +3397,6 @@
           <w:rFonts w:cs="B Nazanin"/>
           <w:sz w:val="28"/>
           <w:szCs w:val="28"/>
-          <w:rtl/>
           <w:lang w:val="en-US"/>
         </w:rPr>
       </w:pPr>
@@ -2698,7 +3475,176 @@
           <w:sz w:val="28"/>
           <w:szCs w:val="28"/>
           <w:rtl/>
-          <w:lang w:val="en-US" w:bidi="fa-IR"/>
+          <w:lang w:val="en-US"/>
+        </w:rPr>
+      </w:pPr>
+      <w:r>
+        <w:rPr>
+          <w:rFonts w:cs="B Nazanin"/>
+          <w:sz w:val="28"/>
+          <w:szCs w:val="28"/>
+          <w:rtl/>
+          <w:lang w:val="en-US"/>
+        </w:rPr>
+        <w:t>از منظر فنی، به‌کارگیری ترکیبی از تکنیک‌های پردازش تصویر (</w:t>
+      </w:r>
+      <w:r>
+        <w:rPr>
+          <w:rFonts w:cs="B Nazanin"/>
+          <w:sz w:val="28"/>
+          <w:szCs w:val="28"/>
+          <w:lang w:val="en-US" w:bidi="fa-IR"/>
+        </w:rPr>
+        <w:t>Tesseract OCR</w:t>
+      </w:r>
+      <w:r>
+        <w:rPr>
+          <w:rFonts w:cs="B Nazanin"/>
+          <w:sz w:val="28"/>
+          <w:szCs w:val="28"/>
+          <w:rtl/>
+          <w:lang w:val="en-US"/>
+        </w:rPr>
+        <w:t xml:space="preserve">) برای استخراج متون فارسی از فایل‌های </w:t>
+      </w:r>
+      <w:r>
+        <w:rPr>
+          <w:rFonts w:cs="B Nazanin"/>
+          <w:sz w:val="28"/>
+          <w:szCs w:val="28"/>
+          <w:lang w:val="en-US" w:bidi="fa-IR"/>
+        </w:rPr>
+        <w:t>PDF</w:t>
+      </w:r>
+      <w:r>
+        <w:rPr>
+          <w:rFonts w:cs="B Nazanin"/>
+          <w:sz w:val="28"/>
+          <w:szCs w:val="28"/>
+          <w:rtl/>
+          <w:lang w:val="en-US"/>
+        </w:rPr>
+        <w:t xml:space="preserve"> اسکن‌شده، و همچنین نرمال‌سازی داده‌ها با استفاده از ابزارهای پردازش زبان طبیعی (</w:t>
+      </w:r>
+      <w:r>
+        <w:rPr>
+          <w:rFonts w:cs="B Nazanin"/>
+          <w:sz w:val="28"/>
+          <w:szCs w:val="28"/>
+          <w:lang w:val="en-US" w:bidi="fa-IR"/>
+        </w:rPr>
+        <w:t>NLP</w:t>
+      </w:r>
+      <w:r>
+        <w:rPr>
+          <w:rFonts w:cs="B Nazanin"/>
+          <w:sz w:val="28"/>
+          <w:szCs w:val="28"/>
+          <w:rtl/>
+          <w:lang w:val="en-US"/>
+        </w:rPr>
+        <w:t xml:space="preserve">)، کیفیت داده‌های ورودی را به شدت افزایش داد. علاوه بر این، پیاده‌سازی الگوریتم پیشرفته‌ی </w:t>
+      </w:r>
+      <w:r>
+        <w:rPr>
+          <w:rFonts w:cs="B Nazanin"/>
+          <w:sz w:val="28"/>
+          <w:szCs w:val="28"/>
+          <w:lang w:val="en-US" w:bidi="fa-IR"/>
+        </w:rPr>
+        <w:t>MMR (Maximal Marginal Relevance)</w:t>
+      </w:r>
+      <w:r>
+        <w:rPr>
+          <w:rFonts w:cs="B Nazanin"/>
+          <w:sz w:val="28"/>
+          <w:szCs w:val="28"/>
+          <w:rtl/>
+          <w:lang w:val="en-US"/>
+        </w:rPr>
+        <w:t xml:space="preserve"> در فاز بازیابی اطلاعات، باعث شد تا سیستم بر مشکلاتی نظیر استخراج متون تکراری غلبه کرده و متنوع‌ترین و مرتبط‌ترین بندهای قانونی را برای تحلیل به مدل زبانی قدرتمند </w:t>
+      </w:r>
+      <w:r>
+        <w:rPr>
+          <w:rFonts w:cs="B Nazanin"/>
+          <w:sz w:val="28"/>
+          <w:szCs w:val="28"/>
+          <w:lang w:val="en-US" w:bidi="fa-IR"/>
+        </w:rPr>
+        <w:t>Llama-3.3</w:t>
+      </w:r>
+      <w:r>
+        <w:rPr>
+          <w:rFonts w:cs="B Nazanin"/>
+          <w:sz w:val="28"/>
+          <w:szCs w:val="28"/>
+          <w:rtl/>
+          <w:lang w:val="en-US"/>
+        </w:rPr>
+        <w:t xml:space="preserve"> ارسال کند.</w:t>
+      </w:r>
+    </w:p>
+    <w:p>
+      <w:pPr>
+        <w:rPr>
+          <w:rFonts w:cs="B Nazanin"/>
+          <w:sz w:val="28"/>
+          <w:szCs w:val="28"/>
+          <w:rtl/>
+          <w:lang w:val="en-US"/>
+        </w:rPr>
+      </w:pPr>
+      <w:r>
+        <w:rPr>
+          <w:rFonts w:cs="B Nazanin"/>
+          <w:b/>
+          <w:bCs/>
+          <w:sz w:val="28"/>
+          <w:szCs w:val="28"/>
+          <w:rtl/>
+          <w:lang w:val="en-US"/>
+        </w:rPr>
+        <w:t>اتکاپذیری و جلوگیری از تولید اطلاعات غلط:</w:t>
+      </w:r>
+      <w:r>
+        <w:rPr>
+          <w:rFonts w:cs="B Nazanin"/>
+          <w:sz w:val="28"/>
+          <w:szCs w:val="28"/>
+          <w:rtl/>
+          <w:lang w:val="en-US"/>
+        </w:rPr>
+        <w:br/>
+        <w:t>یکی از مهم‌ترین دستاوردهای کاربردی این سامانه، جلوگیری کامل از پدیده توهم (</w:t>
+      </w:r>
+      <w:r>
+        <w:rPr>
+          <w:rFonts w:cs="B Nazanin"/>
+          <w:sz w:val="28"/>
+          <w:szCs w:val="28"/>
+          <w:lang w:val="en-US" w:bidi="fa-IR"/>
+        </w:rPr>
+        <w:t>Hallucination</w:t>
+      </w:r>
+      <w:r>
+        <w:rPr>
+          <w:rFonts w:cs="B Nazanin"/>
+          <w:sz w:val="28"/>
+          <w:szCs w:val="28"/>
+          <w:rtl/>
+          <w:lang w:val="en-US"/>
+        </w:rPr>
+        <w:t>) در هوش مصنوعی است. سیستم به گونه‌ای برنامه‌ریزی شده است که در صورت عدم وجود اطلاعات در مستندات پایگاه دانش، با شفافیت کامل از ارائه اطلاعات ساختگی خودداری کرده و کاربر را مطلع می‌سازد. همچنین، قابلیت ارجاع‌دهی دقیق به نام فایل و شماره صفحه مستندات، امکان راستی‌آزمایی را برای دانشجویان و کارشناسان آموزش فراهم کرده و اعتماد به این دستیار هوشمند را در محیط‌های رسمی افزایش می‌دهد.</w:t>
+      </w:r>
+    </w:p>
+    <w:p>
+      <w:pPr>
+        <w:rPr>
+          <w:rFonts w:cs="B Nazanin"/>
+          <w:sz w:val="28"/>
+          <w:szCs w:val="28"/>
+          <w:rtl/>
+          <w:lang w:val="en-US"/>
         </w:rPr>
       </w:pPr>
     </w:p>

</xml_diff>

<commit_message>
docx(Edit some part of report.docx and delete some screenshot)
</commit_message>
<xml_diff>
--- a/report.docx
+++ b/report.docx
@@ -985,7 +985,6 @@
         </w:rPr>
         <w:t>برای مدیریت یکپارچه مسیرها و کلیدهای دسترسی، فایل تنظیماتی ایجاد شده است. در این فایل، مسیر استقرار اسناد (</w:t>
       </w:r>
-      <w:proofErr w:type="spellStart"/>
       <w:r>
         <w:rPr>
           <w:rFonts w:cs="B Nazanin"/>
@@ -995,7 +994,6 @@
         </w:rPr>
         <w:t>pdf_docs</w:t>
       </w:r>
-      <w:proofErr w:type="spellEnd"/>
       <w:r>
         <w:rPr>
           <w:rFonts w:cs="B Nazanin"/>
@@ -1006,7 +1004,6 @@
         </w:rPr>
         <w:t>)، مسیر ذخیره پایگاه داده (</w:t>
       </w:r>
-      <w:proofErr w:type="spellStart"/>
       <w:r>
         <w:rPr>
           <w:rFonts w:cs="B Nazanin"/>
@@ -1016,7 +1013,6 @@
         </w:rPr>
         <w:t>knowledge_db</w:t>
       </w:r>
-      <w:proofErr w:type="spellEnd"/>
       <w:r>
         <w:rPr>
           <w:rFonts w:cs="B Nazanin"/>
@@ -1046,25 +1042,14 @@
         </w:rPr>
         <w:t xml:space="preserve"> با نام </w:t>
       </w:r>
-      <w:proofErr w:type="spellStart"/>
-      <w:r>
-        <w:rPr>
-          <w:rFonts w:cs="B Nazanin"/>
-          <w:sz w:val="28"/>
-          <w:szCs w:val="28"/>
-          <w:lang w:val="en-US" w:bidi="fa-IR"/>
-        </w:rPr>
-        <w:t>intfloat</w:t>
-      </w:r>
-      <w:proofErr w:type="spellEnd"/>
-      <w:r>
-        <w:rPr>
-          <w:rFonts w:cs="B Nazanin"/>
-          <w:sz w:val="28"/>
-          <w:szCs w:val="28"/>
-          <w:lang w:val="en-US" w:bidi="fa-IR"/>
-        </w:rPr>
-        <w:t>/multilingual-e5-large</w:t>
+      <w:r>
+        <w:rPr>
+          <w:rFonts w:cs="B Nazanin"/>
+          <w:sz w:val="28"/>
+          <w:szCs w:val="28"/>
+          <w:lang w:val="en-US" w:bidi="fa-IR"/>
+        </w:rPr>
+        <w:t>intfloat/multilingual-e5-large</w:t>
       </w:r>
       <w:r>
         <w:rPr>
@@ -1203,7 +1188,6 @@
         </w:rPr>
         <w:t xml:space="preserve"> با استفاده از ابزار </w:t>
       </w:r>
-      <w:proofErr w:type="spellStart"/>
       <w:r>
         <w:rPr>
           <w:rFonts w:cs="B Nazanin"/>
@@ -1213,7 +1197,6 @@
         </w:rPr>
         <w:t>poppler</w:t>
       </w:r>
-      <w:proofErr w:type="spellEnd"/>
       <w:r>
         <w:rPr>
           <w:rFonts w:cs="B Nazanin"/>
@@ -1304,7 +1287,6 @@
         </w:rPr>
         <w:t xml:space="preserve"> برای یکسان‌سازی فاصله‌ها و نیم‌فاصله‌ها در زبان فارسی، از کتابخانه </w:t>
       </w:r>
-      <w:proofErr w:type="spellStart"/>
       <w:r>
         <w:rPr>
           <w:rFonts w:cs="B Nazanin"/>
@@ -1314,7 +1296,6 @@
         </w:rPr>
         <w:t>hazm</w:t>
       </w:r>
-      <w:proofErr w:type="spellEnd"/>
       <w:r>
         <w:rPr>
           <w:rFonts w:cs="B Nazanin"/>
@@ -1466,7 +1447,6 @@
         </w:rPr>
         <w:t xml:space="preserve"> به بردار تبدیل شده و در وکتور دیتابیس </w:t>
       </w:r>
-      <w:proofErr w:type="spellStart"/>
       <w:r>
         <w:rPr>
           <w:rFonts w:cs="B Nazanin"/>
@@ -1476,7 +1456,6 @@
         </w:rPr>
         <w:t>ChromaDB</w:t>
       </w:r>
-      <w:proofErr w:type="spellEnd"/>
       <w:r>
         <w:rPr>
           <w:rFonts w:cs="B Nazanin"/>
@@ -1725,25 +1704,14 @@
         </w:rPr>
         <w:t xml:space="preserve"> از طریق </w:t>
       </w:r>
-      <w:proofErr w:type="spellStart"/>
-      <w:r>
-        <w:rPr>
-          <w:rFonts w:cs="B Nazanin"/>
-          <w:sz w:val="28"/>
-          <w:szCs w:val="28"/>
-          <w:lang w:val="en-US" w:bidi="fa-IR"/>
-        </w:rPr>
-        <w:t>Groq</w:t>
-      </w:r>
-      <w:proofErr w:type="spellEnd"/>
-      <w:r>
-        <w:rPr>
-          <w:rFonts w:cs="B Nazanin"/>
-          <w:sz w:val="28"/>
-          <w:szCs w:val="28"/>
-          <w:lang w:val="en-US" w:bidi="fa-IR"/>
-        </w:rPr>
-        <w:t xml:space="preserve"> API</w:t>
+      <w:r>
+        <w:rPr>
+          <w:rFonts w:cs="B Nazanin"/>
+          <w:sz w:val="28"/>
+          <w:szCs w:val="28"/>
+          <w:lang w:val="en-US" w:bidi="fa-IR"/>
+        </w:rPr>
+        <w:t>Groq API</w:t>
       </w:r>
       <w:r>
         <w:rPr>
@@ -1857,7 +1825,6 @@
         </w:rPr>
         <w:t xml:space="preserve"> با استفاده از </w:t>
       </w:r>
-      <w:proofErr w:type="spellStart"/>
       <w:r>
         <w:rPr>
           <w:rFonts w:cs="B Nazanin"/>
@@ -1867,7 +1834,6 @@
         </w:rPr>
         <w:t>Streamlit</w:t>
       </w:r>
-      <w:proofErr w:type="spellEnd"/>
       <w:r>
         <w:rPr>
           <w:rFonts w:cs="B Nazanin"/>
@@ -1925,8 +1891,7 @@
           <w:bCs/>
           <w:sz w:val="32"/>
           <w:szCs w:val="32"/>
-          <w:rtl/>
-          <w:lang w:val="en-US"/>
+          <w:lang w:val="en-US" w:bidi="fa-IR"/>
         </w:rPr>
       </w:pPr>
       <w:r>
@@ -1939,123 +1904,147 @@
           <w:rtl/>
           <w:lang w:val="en-US" w:bidi="fa-IR"/>
         </w:rPr>
-        <w:t xml:space="preserve">۳. </w:t>
-      </w:r>
-      <w:r>
-        <w:rPr>
-          <w:rFonts w:cs="B Nazanin"/>
-          <w:b/>
-          <w:bCs/>
-          <w:sz w:val="32"/>
-          <w:szCs w:val="32"/>
-          <w:rtl/>
-          <w:lang w:val="en-US"/>
-        </w:rPr>
-        <w:t>نمایش محیط برنامه</w:t>
-      </w:r>
-    </w:p>
-    <w:p>
-      <w:pPr>
-        <w:jc w:val="both"/>
-        <w:rPr>
-          <w:rFonts w:cs="B Nazanin"/>
-          <w:sz w:val="28"/>
-          <w:szCs w:val="28"/>
-          <w:rtl/>
-          <w:lang w:val="en-US"/>
-        </w:rPr>
-      </w:pPr>
-      <w:r>
-        <w:rPr>
-          <w:rFonts w:cs="B Nazanin"/>
-          <w:sz w:val="28"/>
-          <w:szCs w:val="28"/>
-          <w:rtl/>
-          <w:lang w:val="en-US"/>
-        </w:rPr>
-        <w:t>رابط کاربری سیستم با تمرکز بر سادگی و کارایی طراحی شده است. کاربر در بالای صفحه یک کادر جستجو مشاهده می‌کند. پس از ثبت پرسش، سیستم در پس‌زمینه شروع به تحلیل ده‌ها صفحه آیین‌نامه کرده و نتیجه را در یک کادر (</w:t>
-      </w:r>
-      <w:r>
-        <w:rPr>
-          <w:rFonts w:cs="B Nazanin"/>
-          <w:sz w:val="28"/>
-          <w:szCs w:val="28"/>
-          <w:lang w:val="en-US" w:bidi="fa-IR"/>
-        </w:rPr>
-        <w:t>Success Box</w:t>
-      </w:r>
-      <w:r>
-        <w:rPr>
-          <w:rFonts w:cs="B Nazanin"/>
-          <w:sz w:val="28"/>
-          <w:szCs w:val="28"/>
-          <w:rtl/>
-          <w:lang w:val="en-US"/>
-        </w:rPr>
-        <w:t>) نمایش می‌دهد. یکی از ویژگی‌های بارز سیستم، نمایش دقیق مستندات ارجاعی در پایین پاسخ است که امکان راستی‌آزمایی را برای کاربر فراهم می‌کند.</w:t>
-      </w:r>
-    </w:p>
-    <w:p>
-      <w:pPr>
-        <w:rPr>
-          <w:rFonts w:cs="B Nazanin"/>
-          <w:sz w:val="28"/>
-          <w:szCs w:val="28"/>
-          <w:rtl/>
-          <w:lang w:val="en-US"/>
-        </w:rPr>
-      </w:pPr>
-      <w:r>
-        <w:rPr>
-          <w:noProof/>
-          <w14:ligatures w14:val="standardContextual"/>
-        </w:rPr>
-        <w:drawing>
-          <wp:inline distT="0" distB="0" distL="0" distR="0" wp14:anchorId="329A224C" wp14:editId="318D0239">
-            <wp:extent cx="5943600" cy="2586355"/>
-            <wp:effectExtent l="0" t="0" r="0" b="4445"/>
-            <wp:docPr id="1026367558" name="Picture 1"/>
-            <wp:cNvGraphicFramePr>
-              <a:graphicFrameLocks xmlns:a="http://schemas.openxmlformats.org/drawingml/2006/main" noChangeAspect="1"/>
-            </wp:cNvGraphicFramePr>
-            <a:graphic xmlns:a="http://schemas.openxmlformats.org/drawingml/2006/main">
-              <a:graphicData uri="http://schemas.openxmlformats.org/drawingml/2006/picture">
-                <pic:pic xmlns:pic="http://schemas.openxmlformats.org/drawingml/2006/picture">
-                  <pic:nvPicPr>
-                    <pic:cNvPr id="1026367558" name=""/>
-                    <pic:cNvPicPr/>
-                  </pic:nvPicPr>
-                  <pic:blipFill>
-                    <a:blip r:embed="rId8"/>
-                    <a:stretch>
-                      <a:fillRect/>
-                    </a:stretch>
-                  </pic:blipFill>
-                  <pic:spPr>
-                    <a:xfrm>
-                      <a:off x="0" y="0"/>
-                      <a:ext cx="5943600" cy="2586355"/>
-                    </a:xfrm>
-                    <a:prstGeom prst="rect">
-                      <a:avLst/>
-                    </a:prstGeom>
-                  </pic:spPr>
-                </pic:pic>
-              </a:graphicData>
-            </a:graphic>
-          </wp:inline>
-        </w:drawing>
-      </w:r>
-    </w:p>
-    <w:p>
-      <w:pPr>
-        <w:rPr>
-          <w:rFonts w:cs="B Nazanin"/>
-          <w:sz w:val="28"/>
-          <w:szCs w:val="28"/>
-          <w:lang w:val="en-US"/>
-        </w:rPr>
-      </w:pPr>
+        <w:t>۳. نمایش محیط برنامه و سناریوهای کاربری</w:t>
+      </w:r>
+    </w:p>
+    <w:p>
+      <w:pPr>
+        <w:rPr>
+          <w:rFonts w:cs="B Nazanin"/>
+          <w:sz w:val="28"/>
+          <w:szCs w:val="28"/>
+          <w:rtl/>
+          <w:lang w:val="en-US"/>
+        </w:rPr>
+      </w:pPr>
+      <w:r>
+        <w:rPr>
+          <w:rFonts w:cs="B Nazanin"/>
+          <w:sz w:val="28"/>
+          <w:szCs w:val="28"/>
+          <w:rtl/>
+          <w:lang w:val="en-US"/>
+        </w:rPr>
+        <w:t>رابط کاربری این سامانه با تمرکز بر سادگی، کارایی و تجربه کاربری (</w:t>
+      </w:r>
+      <w:r>
+        <w:rPr>
+          <w:rFonts w:cs="B Nazanin"/>
+          <w:sz w:val="28"/>
+          <w:szCs w:val="28"/>
+          <w:lang w:val="en-US"/>
+        </w:rPr>
+        <w:t>UX</w:t>
+      </w:r>
+      <w:r>
+        <w:rPr>
+          <w:rFonts w:cs="B Nazanin"/>
+          <w:sz w:val="28"/>
+          <w:szCs w:val="28"/>
+          <w:rtl/>
+          <w:lang w:val="en-US"/>
+        </w:rPr>
+        <w:t>) بهینه طراحی شده است. استفاده از تم تیره (</w:t>
+      </w:r>
+      <w:r>
+        <w:rPr>
+          <w:rFonts w:cs="B Nazanin"/>
+          <w:sz w:val="28"/>
+          <w:szCs w:val="28"/>
+          <w:lang w:val="en-US"/>
+        </w:rPr>
+        <w:t>Dark Mode</w:t>
+      </w:r>
+      <w:r>
+        <w:rPr>
+          <w:rFonts w:cs="B Nazanin"/>
+          <w:sz w:val="28"/>
+          <w:szCs w:val="28"/>
+          <w:rtl/>
+          <w:lang w:val="en-US"/>
+        </w:rPr>
+        <w:t>)، کادرهای تفکیک‌شده و قالب‌بندی کاملاً راست‌چین (</w:t>
+      </w:r>
+      <w:r>
+        <w:rPr>
+          <w:rFonts w:cs="B Nazanin"/>
+          <w:sz w:val="28"/>
+          <w:szCs w:val="28"/>
+          <w:lang w:val="en-US"/>
+        </w:rPr>
+        <w:t>RTL</w:t>
+      </w:r>
+      <w:r>
+        <w:rPr>
+          <w:rFonts w:cs="B Nazanin"/>
+          <w:sz w:val="28"/>
+          <w:szCs w:val="28"/>
+          <w:rtl/>
+          <w:lang w:val="en-US"/>
+        </w:rPr>
+        <w:t>)، فضایی مدرن و خوانا را برای کاربر فارسی‌زبان فراهم کرده است. در ادامه، عملکرد سامانه در قالب سناریوهای مختلف اجرایی بررسی شده است:</w:t>
+      </w:r>
+    </w:p>
+    <w:p>
+      <w:pPr>
+        <w:rPr>
+          <w:rFonts w:cs="B Nazanin"/>
+          <w:sz w:val="28"/>
+          <w:szCs w:val="28"/>
+          <w:rtl/>
+          <w:lang w:val="en-US"/>
+        </w:rPr>
+      </w:pPr>
+      <w:r>
+        <w:rPr>
+          <w:rFonts w:cs="B Nazanin"/>
+          <w:sz w:val="28"/>
+          <w:szCs w:val="28"/>
+          <w:rtl/>
+          <w:lang w:val="en-US"/>
+        </w:rPr>
+        <w:t>۳-۱. نمای اولیه و صفحه ورود پرسش</w:t>
+      </w:r>
+    </w:p>
+    <w:p>
+      <w:pPr>
+        <w:rPr>
+          <w:rFonts w:cs="B Nazanin"/>
+          <w:sz w:val="28"/>
+          <w:szCs w:val="28"/>
+          <w:rtl/>
+          <w:lang w:val="en-US"/>
+        </w:rPr>
+      </w:pPr>
+      <w:r>
+        <w:rPr>
+          <w:rFonts w:cs="B Nazanin"/>
+          <w:sz w:val="28"/>
+          <w:szCs w:val="28"/>
+          <w:rtl/>
+          <w:lang w:val="en-US"/>
+        </w:rPr>
+        <w:t>هنگامی که کاربر سامانه را اجرا می‌کند، با یک محیط یکپارچه مواجه می‌شود که شامل عنوان برنامه و یک کادر متنی ساده برای دریافت پرسش است. کاربر می‌تواند سؤال خود را به زبان محاوره یا رسمی در این کادر تایپ کرده و روی دکمه «جستجو» کلیک کند. بلافاصله پس از کلیک، یک نشانگر در حال چرخش (</w:t>
+      </w:r>
+      <w:r>
+        <w:rPr>
+          <w:rFonts w:cs="B Nazanin"/>
+          <w:sz w:val="28"/>
+          <w:szCs w:val="28"/>
+          <w:lang w:val="en-US"/>
+        </w:rPr>
+        <w:t>Spinner</w:t>
+      </w:r>
+      <w:r>
+        <w:rPr>
+          <w:rFonts w:cs="B Nazanin"/>
+          <w:sz w:val="28"/>
+          <w:szCs w:val="28"/>
+          <w:rtl/>
+          <w:lang w:val="en-US"/>
+        </w:rPr>
+        <w:t xml:space="preserve">) با پیام "لطفا صبر کنید... سیستم در حال تحلیل مستندات است..." ظاهر می‌شود که نشان‌دهنده آغاز فرآیند </w:t>
+      </w:r>
       <w:r>
         <w:rPr>
           <w:rFonts w:cs="B Nazanin"/>
@@ -2065,146 +2054,7 @@
           <w:lang w:val="en-US"/>
         </w:rPr>
         <w:lastRenderedPageBreak/>
-        <w:t>۳. نمایش محیط برنامه و سناریوهای کاربری</w:t>
-      </w:r>
-    </w:p>
-    <w:p>
-      <w:pPr>
-        <w:rPr>
-          <w:rFonts w:cs="B Nazanin"/>
-          <w:sz w:val="28"/>
-          <w:szCs w:val="28"/>
-          <w:rtl/>
-          <w:lang w:val="en-US"/>
-        </w:rPr>
-      </w:pPr>
-      <w:r>
-        <w:rPr>
-          <w:rFonts w:cs="B Nazanin"/>
-          <w:sz w:val="28"/>
-          <w:szCs w:val="28"/>
-          <w:rtl/>
-          <w:lang w:val="en-US"/>
-        </w:rPr>
-        <w:t>رابط کاربری این سامانه با تمرکز بر سادگی، کارایی و تجربه کاربری (</w:t>
-      </w:r>
-      <w:r>
-        <w:rPr>
-          <w:rFonts w:cs="B Nazanin"/>
-          <w:sz w:val="28"/>
-          <w:szCs w:val="28"/>
-          <w:lang w:val="en-US"/>
-        </w:rPr>
-        <w:t>UX</w:t>
-      </w:r>
-      <w:r>
-        <w:rPr>
-          <w:rFonts w:cs="B Nazanin"/>
-          <w:sz w:val="28"/>
-          <w:szCs w:val="28"/>
-          <w:rtl/>
-          <w:lang w:val="en-US"/>
-        </w:rPr>
-        <w:t>) بهینه طراحی شده است. استفاده از تم تیره (</w:t>
-      </w:r>
-      <w:r>
-        <w:rPr>
-          <w:rFonts w:cs="B Nazanin"/>
-          <w:sz w:val="28"/>
-          <w:szCs w:val="28"/>
-          <w:lang w:val="en-US"/>
-        </w:rPr>
-        <w:t>Dark Mode</w:t>
-      </w:r>
-      <w:r>
-        <w:rPr>
-          <w:rFonts w:cs="B Nazanin"/>
-          <w:sz w:val="28"/>
-          <w:szCs w:val="28"/>
-          <w:rtl/>
-          <w:lang w:val="en-US"/>
-        </w:rPr>
-        <w:t>)، کادرهای تفکیک‌شده و قالب‌بندی کاملاً راست‌چین (</w:t>
-      </w:r>
-      <w:r>
-        <w:rPr>
-          <w:rFonts w:cs="B Nazanin"/>
-          <w:sz w:val="28"/>
-          <w:szCs w:val="28"/>
-          <w:lang w:val="en-US"/>
-        </w:rPr>
-        <w:t>RTL</w:t>
-      </w:r>
-      <w:r>
-        <w:rPr>
-          <w:rFonts w:cs="B Nazanin"/>
-          <w:sz w:val="28"/>
-          <w:szCs w:val="28"/>
-          <w:rtl/>
-          <w:lang w:val="en-US"/>
-        </w:rPr>
-        <w:t>)، فضایی مدرن و خوانا را برای کاربر فارسی‌زبان فراهم کرده است. در ادامه، عملکرد سامانه در قالب سناریوهای مختلف اجرایی بررسی شده است:</w:t>
-      </w:r>
-    </w:p>
-    <w:p>
-      <w:pPr>
-        <w:rPr>
-          <w:rFonts w:cs="B Nazanin"/>
-          <w:sz w:val="28"/>
-          <w:szCs w:val="28"/>
-          <w:rtl/>
-          <w:lang w:val="en-US"/>
-        </w:rPr>
-      </w:pPr>
-      <w:r>
-        <w:rPr>
-          <w:rFonts w:cs="B Nazanin"/>
-          <w:sz w:val="28"/>
-          <w:szCs w:val="28"/>
-          <w:rtl/>
-          <w:lang w:val="en-US"/>
-        </w:rPr>
-        <w:t>۳-۱. نمای اولیه و صفحه ورود پرسش</w:t>
-      </w:r>
-    </w:p>
-    <w:p>
-      <w:pPr>
-        <w:rPr>
-          <w:rFonts w:cs="B Nazanin"/>
-          <w:sz w:val="28"/>
-          <w:szCs w:val="28"/>
-          <w:rtl/>
-          <w:lang w:val="en-US"/>
-        </w:rPr>
-      </w:pPr>
-      <w:r>
-        <w:rPr>
-          <w:rFonts w:cs="B Nazanin"/>
-          <w:sz w:val="28"/>
-          <w:szCs w:val="28"/>
-          <w:rtl/>
-          <w:lang w:val="en-US"/>
-        </w:rPr>
-        <w:t>هنگامی که کاربر سامانه را اجرا می‌کند، با یک محیط یکپارچه مواجه می‌شود که شامل عنوان برنامه و یک کادر متنی ساده برای دریافت پرسش است. کاربر می‌تواند سؤال خود را به زبان محاوره یا رسمی در این کادر تایپ کرده و روی دکمه «جستجو» کلیک کند. بلافاصله پس از کلیک، یک نشانگر در حال چرخش (</w:t>
-      </w:r>
-      <w:r>
-        <w:rPr>
-          <w:rFonts w:cs="B Nazanin"/>
-          <w:sz w:val="28"/>
-          <w:szCs w:val="28"/>
-          <w:lang w:val="en-US"/>
-        </w:rPr>
-        <w:t>Spinner</w:t>
-      </w:r>
-      <w:r>
-        <w:rPr>
-          <w:rFonts w:cs="B Nazanin"/>
-          <w:sz w:val="28"/>
-          <w:szCs w:val="28"/>
-          <w:rtl/>
-          <w:lang w:val="en-US"/>
-        </w:rPr>
-        <w:t xml:space="preserve">) با پیام "لطفا صبر کنید... سیستم در حال تحلیل مستندات است..." ظاهر می‌شود که نشان‌دهنده آغاز فرآیند جستجوی برداری و ارتباط با </w:t>
+        <w:t xml:space="preserve">جستجوی برداری و ارتباط با </w:t>
       </w:r>
       <w:r>
         <w:rPr>
@@ -2256,7 +2106,7 @@
                     <pic:cNvPicPr/>
                   </pic:nvPicPr>
                   <pic:blipFill>
-                    <a:blip r:embed="rId9"/>
+                    <a:blip r:embed="rId8"/>
                     <a:stretch>
                       <a:fillRect/>
                     </a:stretch>
@@ -2403,7 +2253,6 @@
           <w:noProof/>
           <w14:ligatures w14:val="standardContextual"/>
         </w:rPr>
-        <w:lastRenderedPageBreak/>
         <w:drawing>
           <wp:inline distT="0" distB="0" distL="0" distR="0" wp14:anchorId="6B16C6A5" wp14:editId="39E9BC26">
             <wp:extent cx="5943600" cy="1957070"/>
@@ -2420,7 +2269,7 @@
                     <pic:cNvPicPr/>
                   </pic:nvPicPr>
                   <pic:blipFill>
-                    <a:blip r:embed="rId10"/>
+                    <a:blip r:embed="rId9"/>
                     <a:stretch>
                       <a:fillRect/>
                     </a:stretch>
@@ -2472,7 +2321,7 @@
                     <pic:cNvPicPr/>
                   </pic:nvPicPr>
                   <pic:blipFill>
-                    <a:blip r:embed="rId11"/>
+                    <a:blip r:embed="rId10"/>
                     <a:stretch>
                       <a:fillRect/>
                     </a:stretch>
@@ -2525,7 +2374,7 @@
                     <pic:cNvPicPr/>
                   </pic:nvPicPr>
                   <pic:blipFill>
-                    <a:blip r:embed="rId12"/>
+                    <a:blip r:embed="rId11"/>
                     <a:stretch>
                       <a:fillRect/>
                     </a:stretch>
@@ -2678,7 +2527,7 @@
                     <pic:cNvPicPr/>
                   </pic:nvPicPr>
                   <pic:blipFill>
-                    <a:blip r:embed="rId13"/>
+                    <a:blip r:embed="rId12"/>
                     <a:stretch>
                       <a:fillRect/>
                     </a:stretch>
@@ -2898,7 +2747,6 @@
         </w:rPr>
         <w:t xml:space="preserve"> نصب کتابخانه‌های مورد نیاز از جمله </w:t>
       </w:r>
-      <w:proofErr w:type="spellStart"/>
       <w:r>
         <w:rPr>
           <w:rFonts w:cs="B Nazanin"/>
@@ -2908,7 +2756,6 @@
         </w:rPr>
         <w:t>streamlit</w:t>
       </w:r>
-      <w:proofErr w:type="spellEnd"/>
       <w:r>
         <w:rPr>
           <w:rFonts w:cs="B Nazanin"/>
@@ -2919,7 +2766,6 @@
         </w:rPr>
         <w:t xml:space="preserve">، </w:t>
       </w:r>
-      <w:proofErr w:type="spellStart"/>
       <w:r>
         <w:rPr>
           <w:rFonts w:cs="B Nazanin"/>
@@ -2929,7 +2775,6 @@
         </w:rPr>
         <w:t>langchain</w:t>
       </w:r>
-      <w:proofErr w:type="spellEnd"/>
       <w:r>
         <w:rPr>
           <w:rFonts w:cs="B Nazanin"/>
@@ -2940,7 +2785,6 @@
         </w:rPr>
         <w:t xml:space="preserve">، </w:t>
       </w:r>
-      <w:proofErr w:type="spellStart"/>
       <w:r>
         <w:rPr>
           <w:rFonts w:cs="B Nazanin"/>
@@ -2950,7 +2794,6 @@
         </w:rPr>
         <w:t>chromadb</w:t>
       </w:r>
-      <w:proofErr w:type="spellEnd"/>
       <w:r>
         <w:rPr>
           <w:rFonts w:cs="B Nazanin"/>
@@ -2961,7 +2804,6 @@
         </w:rPr>
         <w:t xml:space="preserve">، </w:t>
       </w:r>
-      <w:proofErr w:type="spellStart"/>
       <w:r>
         <w:rPr>
           <w:rFonts w:cs="B Nazanin"/>
@@ -2971,7 +2813,6 @@
         </w:rPr>
         <w:t>hazm</w:t>
       </w:r>
-      <w:proofErr w:type="spellEnd"/>
       <w:r>
         <w:rPr>
           <w:rFonts w:cs="B Nazanin"/>
@@ -3001,7 +2842,6 @@
         </w:rPr>
         <w:t xml:space="preserve"> و </w:t>
       </w:r>
-      <w:proofErr w:type="spellStart"/>
       <w:r>
         <w:rPr>
           <w:rFonts w:cs="B Nazanin"/>
@@ -3011,7 +2851,6 @@
         </w:rPr>
         <w:t>pytesseract</w:t>
       </w:r>
-      <w:proofErr w:type="spellEnd"/>
       <w:r>
         <w:rPr>
           <w:rFonts w:cs="B Nazanin"/>
@@ -3107,7 +2946,6 @@
         </w:rPr>
         <w:t xml:space="preserve"> (به همراه داده‌های زبان </w:t>
       </w:r>
-      <w:proofErr w:type="spellStart"/>
       <w:r>
         <w:rPr>
           <w:rFonts w:cs="B Nazanin"/>
@@ -3117,7 +2955,6 @@
         </w:rPr>
         <w:t>fas</w:t>
       </w:r>
-      <w:proofErr w:type="spellEnd"/>
       <w:r>
         <w:rPr>
           <w:rFonts w:cs="B Nazanin"/>
@@ -3204,7 +3041,6 @@
         </w:rPr>
         <w:t xml:space="preserve"> قرار دادن فایل‌های آیین‌نامه در پوشه‌ی </w:t>
       </w:r>
-      <w:proofErr w:type="spellStart"/>
       <w:r>
         <w:rPr>
           <w:rFonts w:cs="B Nazanin"/>
@@ -3214,7 +3050,6 @@
         </w:rPr>
         <w:t>pdf_docs</w:t>
       </w:r>
-      <w:proofErr w:type="spellEnd"/>
       <w:r>
         <w:rPr>
           <w:rFonts w:cs="B Nazanin"/>
@@ -3244,7 +3079,6 @@
         </w:rPr>
         <w:t xml:space="preserve"> در ترمینال جهت ساخت وکتور دیتابیس در پوشه‌ی </w:t>
       </w:r>
-      <w:proofErr w:type="spellStart"/>
       <w:r>
         <w:rPr>
           <w:rFonts w:cs="B Nazanin"/>
@@ -3254,7 +3088,6 @@
         </w:rPr>
         <w:t>knowledge_db</w:t>
       </w:r>
-      <w:proofErr w:type="spellEnd"/>
       <w:r>
         <w:rPr>
           <w:rFonts w:cs="B Nazanin"/>
@@ -3303,25 +3136,14 @@
         </w:rPr>
         <w:t xml:space="preserve"> اجرای دستور </w:t>
       </w:r>
-      <w:proofErr w:type="spellStart"/>
-      <w:r>
-        <w:rPr>
-          <w:rFonts w:cs="B Nazanin"/>
-          <w:sz w:val="28"/>
-          <w:szCs w:val="28"/>
-          <w:lang w:val="en-US" w:bidi="fa-IR"/>
-        </w:rPr>
-        <w:t>streamlit</w:t>
-      </w:r>
-      <w:proofErr w:type="spellEnd"/>
-      <w:r>
-        <w:rPr>
-          <w:rFonts w:cs="B Nazanin"/>
-          <w:sz w:val="28"/>
-          <w:szCs w:val="28"/>
-          <w:lang w:val="en-US" w:bidi="fa-IR"/>
-        </w:rPr>
-        <w:t xml:space="preserve"> run web_interface.py</w:t>
+      <w:r>
+        <w:rPr>
+          <w:rFonts w:cs="B Nazanin"/>
+          <w:sz w:val="28"/>
+          <w:szCs w:val="28"/>
+          <w:lang w:val="en-US" w:bidi="fa-IR"/>
+        </w:rPr>
+        <w:t>streamlit run web_interface.py</w:t>
       </w:r>
       <w:r>
         <w:rPr>
@@ -4749,6 +4571,7 @@
   <w:style w:type="character" w:default="1" w:styleId="DefaultParagraphFont">
     <w:name w:val="Default Paragraph Font"/>
     <w:uiPriority w:val="1"/>
+    <w:semiHidden/>
     <w:unhideWhenUsed/>
   </w:style>
   <w:style w:type="table" w:default="1" w:styleId="TableNormal">

</xml_diff>